<commit_message>
Brigade signatures, export journal, duplicate fix, dashboard updates
Made-with: Cursor
</commit_message>
<xml_diff>
--- a/templates/docx/dangerous_permits_rus.docx
+++ b/templates/docx/dangerous_permits_rus.docx
@@ -1,6 +1,6 @@
 
 <file path=word/document.xml><?xml version="1.0" encoding="utf-8"?>
-<w:document xmlns:wpc="http://schemas.microsoft.com/office/word/2010/wordprocessingCanvas" xmlns:cx="http://schemas.microsoft.com/office/drawing/2014/chartex" xmlns:cx1="http://schemas.microsoft.com/office/drawing/2015/9/8/chartex" xmlns:cx2="http://schemas.microsoft.com/office/drawing/2015/10/21/chartex" xmlns:cx3="http://schemas.microsoft.com/office/drawing/2016/5/9/chartex" xmlns:cx4="http://schemas.microsoft.com/office/drawing/2016/5/10/chartex" xmlns:cx5="http://schemas.microsoft.com/office/drawing/2016/5/11/chartex" xmlns:cx6="http://schemas.microsoft.com/office/drawing/2016/5/12/chartex" xmlns:cx7="http://schemas.microsoft.com/office/drawing/2016/5/13/chartex" xmlns:cx8="http://schemas.microsoft.com/office/drawing/2016/5/14/chartex" xmlns:mc="http://schemas.openxmlformats.org/markup-compatibility/2006" xmlns:aink="http://schemas.microsoft.com/office/drawing/2016/ink" xmlns:am3d="http://schemas.microsoft.com/office/drawing/2017/model3d" xmlns:o="urn:schemas-microsoft-com:office:office" xmlns:r="http://schemas.openxmlformats.org/officeDocument/2006/relationships" xmlns:m="http://schemas.openxmlformats.org/officeDocument/2006/math" xmlns:v="urn:schemas-microsoft-com:vml" xmlns:wp14="http://schemas.microsoft.com/office/word/2010/wordprocessingDrawing" xmlns:wp="http://schemas.openxmlformats.org/drawingml/2006/wordprocessingDrawing" xmlns:w10="urn:schemas-microsoft-com:office:word" xmlns:w="http://schemas.openxmlformats.org/wordprocessingml/2006/main" xmlns:w14="http://schemas.microsoft.com/office/word/2010/wordml" xmlns:w15="http://schemas.microsoft.com/office/word/2012/wordml" xmlns:w16cex="http://schemas.microsoft.com/office/word/2018/wordml/cex" xmlns:w16cid="http://schemas.microsoft.com/office/word/2016/wordml/cid" xmlns:w16="http://schemas.microsoft.com/office/word/2018/wordml" xmlns:w16sdtdh="http://schemas.microsoft.com/office/word/2020/wordml/sdtdatahash" xmlns:w16se="http://schemas.microsoft.com/office/word/2015/wordml/symex" xmlns:wpg="http://schemas.microsoft.com/office/word/2010/wordprocessingGroup" xmlns:wpi="http://schemas.microsoft.com/office/word/2010/wordprocessingInk" xmlns:wne="http://schemas.microsoft.com/office/word/2006/wordml" xmlns:wps="http://schemas.microsoft.com/office/word/2010/wordprocessingShape" mc:Ignorable="w14 w15 w16se w16cid w16 w16cex w16sdtdh wp14">
+<w:document xmlns:wpc="http://schemas.microsoft.com/office/word/2010/wordprocessingCanvas" xmlns:cx="http://schemas.microsoft.com/office/drawing/2014/chartex" xmlns:mc="http://schemas.openxmlformats.org/markup-compatibility/2006" xmlns:o="urn:schemas-microsoft-com:office:office" xmlns:r="http://schemas.openxmlformats.org/officeDocument/2006/relationships" xmlns:m="http://schemas.openxmlformats.org/officeDocument/2006/math" xmlns:v="urn:schemas-microsoft-com:vml" xmlns:wp14="http://schemas.microsoft.com/office/word/2010/wordprocessingDrawing" xmlns:wp="http://schemas.openxmlformats.org/drawingml/2006/wordprocessingDrawing" xmlns:w10="urn:schemas-microsoft-com:office:word" xmlns:w="http://schemas.openxmlformats.org/wordprocessingml/2006/main" xmlns:w14="http://schemas.microsoft.com/office/word/2010/wordml" xmlns:w15="http://schemas.microsoft.com/office/word/2012/wordml" xmlns:w16se="http://schemas.microsoft.com/office/word/2015/wordml/symex" xmlns:wpg="http://schemas.microsoft.com/office/word/2010/wordprocessingGroup" xmlns:wpi="http://schemas.microsoft.com/office/word/2010/wordprocessingInk" xmlns:wne="http://schemas.microsoft.com/office/word/2006/wordml" xmlns:wps="http://schemas.microsoft.com/office/word/2010/wordprocessingShape" mc:Ignorable="w14 w15 w16se wp14">
   <w:body>
     <w:p>
       <w:pPr>
@@ -965,25 +965,14 @@
         </w:rPr>
         <w:t xml:space="preserve">5.2. Отключить: </w:t>
       </w:r>
-      <w:proofErr w:type="gramStart"/>
-      <w:r>
-        <w:rPr>
-          <w:b/>
-          <w:bCs/>
-          <w:sz w:val="14"/>
-          <w:szCs w:val="14"/>
-        </w:rPr>
-        <w:t>{{ m</w:t>
-      </w:r>
-      <w:proofErr w:type="gramEnd"/>
-      <w:r>
-        <w:rPr>
-          <w:b/>
-          <w:bCs/>
-          <w:sz w:val="14"/>
-          <w:szCs w:val="14"/>
-        </w:rPr>
-        <w:t>5_2 }}</w:t>
+      <w:r>
+        <w:rPr>
+          <w:b/>
+          <w:bCs/>
+          <w:sz w:val="14"/>
+          <w:szCs w:val="14"/>
+        </w:rPr>
+        <w:t>{{ m5_2 }}</w:t>
       </w:r>
       <w:r>
         <w:rPr>
@@ -1082,27 +1071,15 @@
         </w:rPr>
         <w:t xml:space="preserve">Взять пробу для анализа воздушной среды: </w:t>
       </w:r>
-      <w:proofErr w:type="gramStart"/>
-      <w:r>
-        <w:rPr>
-          <w:rStyle w:val="s0"/>
-          <w:b/>
-          <w:bCs/>
-          <w:sz w:val="14"/>
-          <w:szCs w:val="14"/>
-        </w:rPr>
-        <w:t>{{ m</w:t>
-      </w:r>
-      <w:proofErr w:type="gramEnd"/>
-      <w:r>
-        <w:rPr>
-          <w:rStyle w:val="s0"/>
-          <w:b/>
-          <w:bCs/>
-          <w:sz w:val="14"/>
-          <w:szCs w:val="14"/>
-        </w:rPr>
-        <w:t>5_4 }}</w:t>
+      <w:r>
+        <w:rPr>
+          <w:rStyle w:val="s0"/>
+          <w:b/>
+          <w:bCs/>
+          <w:sz w:val="14"/>
+          <w:szCs w:val="14"/>
+        </w:rPr>
+        <w:t>{{ m5_4 }}</w:t>
       </w:r>
       <w:r>
         <w:rPr>
@@ -1143,25 +1120,14 @@
         </w:rPr>
         <w:t xml:space="preserve">5.5. Оградить: </w:t>
       </w:r>
-      <w:proofErr w:type="gramStart"/>
-      <w:r>
-        <w:rPr>
-          <w:b/>
-          <w:bCs/>
-          <w:sz w:val="14"/>
-          <w:szCs w:val="14"/>
-        </w:rPr>
-        <w:t>{{ m</w:t>
-      </w:r>
-      <w:proofErr w:type="gramEnd"/>
-      <w:r>
-        <w:rPr>
-          <w:b/>
-          <w:bCs/>
-          <w:sz w:val="14"/>
-          <w:szCs w:val="14"/>
-        </w:rPr>
-        <w:t>5_5 }}</w:t>
+      <w:r>
+        <w:rPr>
+          <w:b/>
+          <w:bCs/>
+          <w:sz w:val="14"/>
+          <w:szCs w:val="14"/>
+        </w:rPr>
+        <w:t>{{ m5_5 }}</w:t>
       </w:r>
       <w:r>
         <w:rPr>
@@ -1209,25 +1175,14 @@
         </w:rPr>
         <w:t xml:space="preserve"> </w:t>
       </w:r>
-      <w:proofErr w:type="gramStart"/>
-      <w:r>
-        <w:rPr>
-          <w:b/>
-          <w:bCs/>
-          <w:sz w:val="14"/>
-          <w:szCs w:val="14"/>
-        </w:rPr>
-        <w:t>{{ m</w:t>
-      </w:r>
-      <w:proofErr w:type="gramEnd"/>
-      <w:r>
-        <w:rPr>
-          <w:b/>
-          <w:bCs/>
-          <w:sz w:val="14"/>
-          <w:szCs w:val="14"/>
-        </w:rPr>
-        <w:t>5_6 }}</w:t>
+      <w:r>
+        <w:rPr>
+          <w:b/>
+          <w:bCs/>
+          <w:sz w:val="14"/>
+          <w:szCs w:val="14"/>
+        </w:rPr>
+        <w:t>{{ m5_6 }}</w:t>
       </w:r>
       <w:r>
         <w:rPr>
@@ -1260,25 +1215,14 @@
         </w:rPr>
         <w:t xml:space="preserve">5.7. Предупредить: </w:t>
       </w:r>
-      <w:proofErr w:type="gramStart"/>
-      <w:r>
-        <w:rPr>
-          <w:b/>
-          <w:bCs/>
-          <w:sz w:val="14"/>
-          <w:szCs w:val="14"/>
-        </w:rPr>
-        <w:t>{{ m</w:t>
-      </w:r>
-      <w:proofErr w:type="gramEnd"/>
-      <w:r>
-        <w:rPr>
-          <w:b/>
-          <w:bCs/>
-          <w:sz w:val="14"/>
-          <w:szCs w:val="14"/>
-        </w:rPr>
-        <w:t>5_7 }}</w:t>
+      <w:r>
+        <w:rPr>
+          <w:b/>
+          <w:bCs/>
+          <w:sz w:val="14"/>
+          <w:szCs w:val="14"/>
+        </w:rPr>
+        <w:t>{{ m5_7 }}</w:t>
       </w:r>
       <w:r>
         <w:rPr>
@@ -1320,27 +1264,15 @@
         </w:rPr>
         <w:t xml:space="preserve">Предусмотреть меры безопасности у железнодорожных путей: </w:t>
       </w:r>
-      <w:proofErr w:type="gramStart"/>
-      <w:r>
-        <w:rPr>
-          <w:rStyle w:val="s0"/>
-          <w:b/>
-          <w:bCs/>
-          <w:sz w:val="14"/>
-          <w:szCs w:val="14"/>
-        </w:rPr>
-        <w:t>{{ m</w:t>
-      </w:r>
-      <w:proofErr w:type="gramEnd"/>
-      <w:r>
-        <w:rPr>
-          <w:rStyle w:val="s0"/>
-          <w:b/>
-          <w:bCs/>
-          <w:sz w:val="14"/>
-          <w:szCs w:val="14"/>
-        </w:rPr>
-        <w:t>5_8 }}</w:t>
+      <w:r>
+        <w:rPr>
+          <w:rStyle w:val="s0"/>
+          <w:b/>
+          <w:bCs/>
+          <w:sz w:val="14"/>
+          <w:szCs w:val="14"/>
+        </w:rPr>
+        <w:t>{{ m5_8 }}</w:t>
       </w:r>
       <w:r>
         <w:rPr>
@@ -1394,27 +1326,15 @@
         </w:rPr>
         <w:t xml:space="preserve">Указать маршруты к месту работы: </w:t>
       </w:r>
-      <w:proofErr w:type="gramStart"/>
-      <w:r>
-        <w:rPr>
-          <w:rStyle w:val="s0"/>
-          <w:b/>
-          <w:bCs/>
-          <w:sz w:val="14"/>
-          <w:szCs w:val="14"/>
-        </w:rPr>
-        <w:t>{{ m</w:t>
-      </w:r>
-      <w:proofErr w:type="gramEnd"/>
-      <w:r>
-        <w:rPr>
-          <w:rStyle w:val="s0"/>
-          <w:b/>
-          <w:bCs/>
-          <w:sz w:val="14"/>
-          <w:szCs w:val="14"/>
-        </w:rPr>
-        <w:t>5_9 }}</w:t>
+      <w:r>
+        <w:rPr>
+          <w:rStyle w:val="s0"/>
+          <w:b/>
+          <w:bCs/>
+          <w:sz w:val="14"/>
+          <w:szCs w:val="14"/>
+        </w:rPr>
+        <w:t>{{ m5_9 }}</w:t>
       </w:r>
       <w:r>
         <w:rPr>
@@ -2721,13 +2641,13 @@
               <w:jc w:val="center"/>
               <w:rPr>
                 <w:sz w:val="14"/>
-                <w:szCs w:val="14"/>
+                <w:szCs w:val="20"/>
               </w:rPr>
             </w:pPr>
             <w:r>
               <w:rPr>
                 <w:sz w:val="14"/>
-                <w:szCs w:val="14"/>
+                <w:szCs w:val="20"/>
               </w:rPr>
               <w:t>№</w:t>
             </w:r>
@@ -2737,14 +2657,14 @@
               <w:jc w:val="center"/>
               <w:rPr>
                 <w:sz w:val="14"/>
-                <w:szCs w:val="14"/>
+                <w:szCs w:val="20"/>
               </w:rPr>
             </w:pPr>
             <w:proofErr w:type="spellStart"/>
             <w:r>
               <w:rPr>
                 <w:sz w:val="14"/>
-                <w:szCs w:val="14"/>
+                <w:szCs w:val="20"/>
               </w:rPr>
               <w:t>п.п</w:t>
             </w:r>
@@ -2752,7 +2672,7 @@
             <w:r>
               <w:rPr>
                 <w:sz w:val="14"/>
-                <w:szCs w:val="14"/>
+                <w:szCs w:val="20"/>
               </w:rPr>
               <w:t>.</w:t>
             </w:r>
@@ -2774,13 +2694,13 @@
               <w:jc w:val="center"/>
               <w:rPr>
                 <w:sz w:val="14"/>
-                <w:szCs w:val="14"/>
+                <w:szCs w:val="20"/>
               </w:rPr>
             </w:pPr>
             <w:r>
               <w:rPr>
                 <w:sz w:val="14"/>
-                <w:szCs w:val="14"/>
+                <w:szCs w:val="20"/>
               </w:rPr>
               <w:t>Дата и время проведения работ</w:t>
             </w:r>
@@ -2802,13 +2722,13 @@
               <w:jc w:val="center"/>
               <w:rPr>
                 <w:sz w:val="14"/>
-                <w:szCs w:val="14"/>
+                <w:szCs w:val="20"/>
               </w:rPr>
             </w:pPr>
             <w:r>
               <w:rPr>
                 <w:sz w:val="14"/>
-                <w:szCs w:val="14"/>
+                <w:szCs w:val="20"/>
               </w:rPr>
               <w:t>Ф.И.О. членов бригады</w:t>
             </w:r>
@@ -2831,13 +2751,13 @@
               <w:jc w:val="center"/>
               <w:rPr>
                 <w:sz w:val="14"/>
-                <w:szCs w:val="14"/>
+                <w:szCs w:val="20"/>
               </w:rPr>
             </w:pPr>
             <w:r>
               <w:rPr>
                 <w:sz w:val="14"/>
-                <w:szCs w:val="14"/>
+                <w:szCs w:val="20"/>
               </w:rPr>
               <w:t>Профессия</w:t>
             </w:r>
@@ -2859,13 +2779,13 @@
               <w:jc w:val="center"/>
               <w:rPr>
                 <w:sz w:val="14"/>
-                <w:szCs w:val="14"/>
+                <w:szCs w:val="20"/>
               </w:rPr>
             </w:pPr>
             <w:r>
               <w:rPr>
                 <w:sz w:val="14"/>
-                <w:szCs w:val="14"/>
+                <w:szCs w:val="20"/>
               </w:rPr>
               <w:t>С условиями работы ознакомлен, инструктаж получил (подпись)</w:t>
             </w:r>
@@ -2887,13 +2807,13 @@
               <w:jc w:val="center"/>
               <w:rPr>
                 <w:sz w:val="14"/>
-                <w:szCs w:val="14"/>
+                <w:szCs w:val="20"/>
               </w:rPr>
             </w:pPr>
             <w:r>
               <w:rPr>
                 <w:sz w:val="14"/>
-                <w:szCs w:val="14"/>
+                <w:szCs w:val="20"/>
               </w:rPr>
               <w:t>Инструктаж провел (допускающий Ф.И.О., подпись)</w:t>
             </w:r>
@@ -2918,15 +2838,15 @@
           <w:p>
             <w:pPr>
               <w:rPr>
-                <w:sz w:val="6"/>
-                <w:szCs w:val="6"/>
+                <w:sz w:val="20"/>
+                <w:szCs w:val="20"/>
                 <w:lang w:val="en-US"/>
               </w:rPr>
             </w:pPr>
             <w:r>
               <w:rPr>
-                <w:sz w:val="6"/>
-                <w:szCs w:val="6"/>
+                <w:sz w:val="20"/>
+                <w:szCs w:val="20"/>
                 <w:lang w:val="en-US"/>
               </w:rPr>
               <w:t xml:space="preserve">{%tr for p in </w:t>
@@ -2934,8 +2854,8 @@
             <w:proofErr w:type="spellStart"/>
             <w:r>
               <w:rPr>
-                <w:sz w:val="6"/>
-                <w:szCs w:val="6"/>
+                <w:sz w:val="20"/>
+                <w:szCs w:val="20"/>
                 <w:lang w:val="en-US"/>
               </w:rPr>
               <w:t>brigade_list</w:t>
@@ -2943,8 +2863,8 @@
             <w:proofErr w:type="spellEnd"/>
             <w:r>
               <w:rPr>
-                <w:sz w:val="6"/>
-                <w:szCs w:val="6"/>
+                <w:sz w:val="20"/>
+                <w:szCs w:val="20"/>
                 <w:lang w:val="en-US"/>
               </w:rPr>
               <w:t xml:space="preserve"> %}</w:t>
@@ -2972,16 +2892,14 @@
               <w:jc w:val="center"/>
               <w:rPr>
                 <w:color w:val="000000" w:themeColor="text1"/>
-                <w:sz w:val="14"/>
-                <w:szCs w:val="14"/>
+                <w:szCs w:val="20"/>
                 <w:lang w:val="en-US"/>
               </w:rPr>
             </w:pPr>
             <w:r>
               <w:rPr>
                 <w:color w:val="000000" w:themeColor="text1"/>
-                <w:sz w:val="14"/>
-                <w:szCs w:val="14"/>
+                <w:szCs w:val="20"/>
                 <w:lang w:val="en-US"/>
               </w:rPr>
               <w:t>{{</w:t>
@@ -2990,8 +2908,7 @@
             <w:r>
               <w:rPr>
                 <w:color w:val="000000" w:themeColor="text1"/>
-                <w:sz w:val="14"/>
-                <w:szCs w:val="14"/>
+                <w:szCs w:val="20"/>
                 <w:lang w:val="en-US"/>
               </w:rPr>
               <w:t>p.i</w:t>
@@ -3000,8 +2917,7 @@
             <w:r>
               <w:rPr>
                 <w:color w:val="000000" w:themeColor="text1"/>
-                <w:sz w:val="14"/>
-                <w:szCs w:val="14"/>
+                <w:szCs w:val="20"/>
                 <w:lang w:val="en-US"/>
               </w:rPr>
               <w:t>}}</w:t>
@@ -3024,38 +2940,32 @@
               <w:jc w:val="center"/>
               <w:rPr>
                 <w:color w:val="000000" w:themeColor="text1"/>
-                <w:sz w:val="14"/>
-                <w:szCs w:val="14"/>
+                <w:szCs w:val="20"/>
                 <w:lang w:val="en-US"/>
               </w:rPr>
             </w:pPr>
             <w:r>
               <w:rPr>
                 <w:color w:val="000000" w:themeColor="text1"/>
-                <w:sz w:val="14"/>
-                <w:szCs w:val="14"/>
+                <w:szCs w:val="20"/>
                 <w:lang w:val="en-US"/>
               </w:rPr>
               <w:t>{{</w:t>
             </w:r>
             <w:proofErr w:type="spellStart"/>
-            <w:proofErr w:type="gramStart"/>
             <w:r>
               <w:rPr>
                 <w:color w:val="000000" w:themeColor="text1"/>
-                <w:sz w:val="14"/>
-                <w:szCs w:val="14"/>
+                <w:szCs w:val="20"/>
                 <w:lang w:val="en-US"/>
               </w:rPr>
               <w:t>p.date</w:t>
             </w:r>
             <w:proofErr w:type="spellEnd"/>
-            <w:proofErr w:type="gramEnd"/>
             <w:r>
               <w:rPr>
                 <w:color w:val="000000" w:themeColor="text1"/>
-                <w:sz w:val="14"/>
-                <w:szCs w:val="14"/>
+                <w:szCs w:val="20"/>
                 <w:lang w:val="en-US"/>
               </w:rPr>
               <w:t>}}</w:t>
@@ -3078,19 +2988,27 @@
               <w:jc w:val="center"/>
               <w:rPr>
                 <w:color w:val="000000" w:themeColor="text1"/>
-                <w:sz w:val="14"/>
-                <w:szCs w:val="14"/>
+                <w:szCs w:val="20"/>
                 <w:lang w:val="en-US"/>
               </w:rPr>
             </w:pPr>
             <w:r>
               <w:rPr>
                 <w:color w:val="000000" w:themeColor="text1"/>
-                <w:sz w:val="14"/>
-                <w:szCs w:val="14"/>
+                <w:szCs w:val="20"/>
                 <w:lang w:val="en-US"/>
               </w:rPr>
-              <w:t>{{p.name}}</w:t>
+              <w:t>{{p</w:t>
+            </w:r>
+            <w:bookmarkStart w:id="0" w:name="_GoBack"/>
+            <w:bookmarkEnd w:id="0"/>
+            <w:r>
+              <w:rPr>
+                <w:color w:val="000000" w:themeColor="text1"/>
+                <w:szCs w:val="20"/>
+                <w:lang w:val="en-US"/>
+              </w:rPr>
+              <w:t>.name}}</w:t>
             </w:r>
           </w:p>
         </w:tc>
@@ -3110,16 +3028,14 @@
               <w:jc w:val="center"/>
               <w:rPr>
                 <w:color w:val="000000" w:themeColor="text1"/>
-                <w:sz w:val="14"/>
-                <w:szCs w:val="14"/>
+                <w:szCs w:val="20"/>
                 <w:lang w:val="en-US"/>
               </w:rPr>
             </w:pPr>
             <w:r>
               <w:rPr>
                 <w:color w:val="000000" w:themeColor="text1"/>
-                <w:sz w:val="14"/>
-                <w:szCs w:val="14"/>
+                <w:szCs w:val="20"/>
                 <w:lang w:val="en-US"/>
               </w:rPr>
               <w:t>{{</w:t>
@@ -3128,8 +3044,7 @@
             <w:r>
               <w:rPr>
                 <w:color w:val="000000" w:themeColor="text1"/>
-                <w:sz w:val="14"/>
-                <w:szCs w:val="14"/>
+                <w:szCs w:val="20"/>
                 <w:lang w:val="en-US"/>
               </w:rPr>
               <w:t>p.job</w:t>
@@ -3138,8 +3053,7 @@
             <w:r>
               <w:rPr>
                 <w:color w:val="000000" w:themeColor="text1"/>
-                <w:sz w:val="14"/>
-                <w:szCs w:val="14"/>
+                <w:szCs w:val="20"/>
                 <w:lang w:val="en-US"/>
               </w:rPr>
               <w:t>}}</w:t>
@@ -3162,11 +3076,36 @@
               <w:jc w:val="center"/>
               <w:rPr>
                 <w:color w:val="000000" w:themeColor="text1"/>
-                <w:sz w:val="14"/>
-                <w:szCs w:val="14"/>
+                <w:szCs w:val="20"/>
                 <w:lang w:val="en-US"/>
               </w:rPr>
             </w:pPr>
+            <w:r>
+              <w:rPr>
+                <w:color w:val="000000" w:themeColor="text1"/>
+                <w:szCs w:val="20"/>
+                <w:lang w:val="en-US"/>
+              </w:rPr>
+              <w:t xml:space="preserve">{{ </w:t>
+            </w:r>
+            <w:proofErr w:type="spellStart"/>
+            <w:r>
+              <w:rPr>
+                <w:color w:val="000000" w:themeColor="text1"/>
+                <w:szCs w:val="20"/>
+                <w:lang w:val="en-US"/>
+              </w:rPr>
+              <w:t>p.signature_img</w:t>
+            </w:r>
+            <w:proofErr w:type="spellEnd"/>
+            <w:r>
+              <w:rPr>
+                <w:color w:val="000000" w:themeColor="text1"/>
+                <w:szCs w:val="20"/>
+                <w:lang w:val="en-US"/>
+              </w:rPr>
+              <w:t xml:space="preserve"> }}</w:t>
+            </w:r>
           </w:p>
         </w:tc>
         <w:tc>
@@ -3185,47 +3124,32 @@
               <w:jc w:val="center"/>
               <w:rPr>
                 <w:color w:val="000000" w:themeColor="text1"/>
-                <w:sz w:val="14"/>
-                <w:szCs w:val="14"/>
+                <w:szCs w:val="20"/>
                 <w:lang w:val="en-US"/>
               </w:rPr>
             </w:pPr>
             <w:r>
               <w:rPr>
                 <w:color w:val="000000" w:themeColor="text1"/>
-                <w:sz w:val="14"/>
-                <w:szCs w:val="14"/>
+                <w:szCs w:val="20"/>
                 <w:lang w:val="en-US"/>
               </w:rPr>
               <w:t>{{</w:t>
             </w:r>
             <w:proofErr w:type="spellStart"/>
-            <w:proofErr w:type="gramStart"/>
             <w:r>
               <w:rPr>
                 <w:color w:val="000000" w:themeColor="text1"/>
-                <w:sz w:val="14"/>
-                <w:szCs w:val="14"/>
+                <w:szCs w:val="20"/>
                 <w:lang w:val="en-US"/>
               </w:rPr>
-              <w:t>p.instr</w:t>
-            </w:r>
-            <w:proofErr w:type="gramEnd"/>
+              <w:t>p.instr_by</w:t>
+            </w:r>
+            <w:proofErr w:type="spellEnd"/>
             <w:r>
               <w:rPr>
                 <w:color w:val="000000" w:themeColor="text1"/>
-                <w:sz w:val="14"/>
-                <w:szCs w:val="14"/>
-                <w:lang w:val="en-US"/>
-              </w:rPr>
-              <w:t>_by</w:t>
-            </w:r>
-            <w:proofErr w:type="spellEnd"/>
-            <w:r>
-              <w:rPr>
-                <w:color w:val="000000" w:themeColor="text1"/>
-                <w:sz w:val="14"/>
-                <w:szCs w:val="14"/>
+                <w:szCs w:val="20"/>
                 <w:lang w:val="en-US"/>
               </w:rPr>
               <w:t>}}</w:t>
@@ -3251,46 +3175,40 @@
           <w:p>
             <w:pPr>
               <w:rPr>
-                <w:sz w:val="6"/>
-                <w:szCs w:val="6"/>
+                <w:szCs w:val="20"/>
               </w:rPr>
             </w:pPr>
             <w:r>
               <w:rPr>
-                <w:sz w:val="6"/>
-                <w:szCs w:val="6"/>
+                <w:szCs w:val="20"/>
               </w:rPr>
               <w:t>{%</w:t>
             </w:r>
             <w:proofErr w:type="spellStart"/>
             <w:r>
               <w:rPr>
-                <w:sz w:val="6"/>
-                <w:szCs w:val="6"/>
+                <w:szCs w:val="20"/>
               </w:rPr>
               <w:t>tr</w:t>
             </w:r>
             <w:proofErr w:type="spellEnd"/>
             <w:r>
               <w:rPr>
-                <w:sz w:val="6"/>
-                <w:szCs w:val="6"/>
+                <w:szCs w:val="20"/>
               </w:rPr>
               <w:t xml:space="preserve"> </w:t>
             </w:r>
             <w:proofErr w:type="spellStart"/>
             <w:r>
               <w:rPr>
-                <w:sz w:val="6"/>
-                <w:szCs w:val="6"/>
+                <w:szCs w:val="20"/>
               </w:rPr>
               <w:t>endfor</w:t>
             </w:r>
             <w:proofErr w:type="spellEnd"/>
             <w:r>
               <w:rPr>
-                <w:sz w:val="6"/>
-                <w:szCs w:val="6"/>
+                <w:szCs w:val="20"/>
               </w:rPr>
               <w:t xml:space="preserve"> %}</w:t>
             </w:r>
@@ -3312,18 +3230,8 @@
           <w:szCs w:val="14"/>
           <w:lang w:val="kk-KZ"/>
         </w:rPr>
-        <w:t xml:space="preserve">Бригада(ы) в </w:t>
-      </w:r>
-      <w:proofErr w:type="spellStart"/>
-      <w:r>
-        <w:rPr>
-          <w:sz w:val="14"/>
-          <w:szCs w:val="14"/>
-          <w:lang w:val="kk-KZ"/>
-        </w:rPr>
-        <w:t>количестве</w:t>
-      </w:r>
-      <w:proofErr w:type="spellEnd"/>
+        <w:t>Бригада(ы) в количестве</w:t>
+      </w:r>
       <w:r>
         <w:rPr>
           <w:sz w:val="14"/>
@@ -3367,70 +3275,14 @@
         </w:rPr>
         <w:t xml:space="preserve">   </w:t>
       </w:r>
-      <w:proofErr w:type="spellStart"/>
       <w:r>
         <w:rPr>
           <w:sz w:val="14"/>
           <w:szCs w:val="14"/>
           <w:lang w:val="kk-KZ"/>
         </w:rPr>
-        <w:t>человек</w:t>
-      </w:r>
-      <w:proofErr w:type="spellEnd"/>
-      <w:r>
-        <w:rPr>
-          <w:sz w:val="14"/>
-          <w:szCs w:val="14"/>
-          <w:lang w:val="kk-KZ"/>
-        </w:rPr>
-        <w:t xml:space="preserve"> </w:t>
-      </w:r>
-      <w:proofErr w:type="spellStart"/>
-      <w:r>
-        <w:rPr>
-          <w:sz w:val="14"/>
-          <w:szCs w:val="14"/>
-          <w:lang w:val="kk-KZ"/>
-        </w:rPr>
-        <w:t>проинструктировал</w:t>
-      </w:r>
-      <w:proofErr w:type="spellEnd"/>
-      <w:r>
-        <w:rPr>
-          <w:sz w:val="14"/>
-          <w:szCs w:val="14"/>
-          <w:lang w:val="kk-KZ"/>
-        </w:rPr>
-        <w:t xml:space="preserve">, к </w:t>
-      </w:r>
-      <w:proofErr w:type="spellStart"/>
-      <w:r>
-        <w:rPr>
-          <w:sz w:val="14"/>
-          <w:szCs w:val="14"/>
-          <w:lang w:val="kk-KZ"/>
-        </w:rPr>
-        <w:t>работе</w:t>
-      </w:r>
-      <w:proofErr w:type="spellEnd"/>
-      <w:r>
-        <w:rPr>
-          <w:sz w:val="14"/>
-          <w:szCs w:val="14"/>
-          <w:lang w:val="kk-KZ"/>
-        </w:rPr>
-        <w:t xml:space="preserve"> </w:t>
-      </w:r>
-      <w:proofErr w:type="spellStart"/>
-      <w:r>
-        <w:rPr>
-          <w:sz w:val="14"/>
-          <w:szCs w:val="14"/>
-          <w:lang w:val="kk-KZ"/>
-        </w:rPr>
-        <w:t>приступил</w:t>
-      </w:r>
-      <w:proofErr w:type="spellEnd"/>
+        <w:t>человек проинструктировал, к работе приступил</w:t>
+      </w:r>
       <w:r>
         <w:rPr>
           <w:sz w:val="16"/>
@@ -3830,7 +3682,6 @@
               <w:t>{{</w:t>
             </w:r>
             <w:proofErr w:type="spellStart"/>
-            <w:proofErr w:type="gramStart"/>
             <w:r>
               <w:rPr>
                 <w:sz w:val="12"/>
@@ -3840,7 +3691,6 @@
               <w:t>e.date</w:t>
             </w:r>
             <w:proofErr w:type="spellEnd"/>
-            <w:proofErr w:type="gramEnd"/>
             <w:r>
               <w:rPr>
                 <w:sz w:val="12"/>
@@ -3877,21 +3727,12 @@
               <w:t>{{</w:t>
             </w:r>
             <w:proofErr w:type="spellStart"/>
-            <w:proofErr w:type="gramStart"/>
             <w:r>
               <w:rPr>
                 <w:sz w:val="12"/>
                 <w:szCs w:val="12"/>
               </w:rPr>
-              <w:t>e.prod</w:t>
-            </w:r>
-            <w:proofErr w:type="gramEnd"/>
-            <w:r>
-              <w:rPr>
-                <w:sz w:val="12"/>
-                <w:szCs w:val="12"/>
-              </w:rPr>
-              <w:t>_out</w:t>
+              <w:t>e.prod_out</w:t>
             </w:r>
             <w:proofErr w:type="spellEnd"/>
             <w:r>
@@ -3957,7 +3798,6 @@
               <w:t>{{</w:t>
             </w:r>
             <w:proofErr w:type="spellStart"/>
-            <w:proofErr w:type="gramStart"/>
             <w:r>
               <w:rPr>
                 <w:sz w:val="12"/>
@@ -3966,7 +3806,6 @@
               <w:t>e.count</w:t>
             </w:r>
             <w:proofErr w:type="spellEnd"/>
-            <w:proofErr w:type="gramEnd"/>
             <w:r>
               <w:rPr>
                 <w:sz w:val="12"/>
@@ -4002,21 +3841,12 @@
               <w:t>{{</w:t>
             </w:r>
             <w:proofErr w:type="spellStart"/>
-            <w:proofErr w:type="gramStart"/>
             <w:r>
               <w:rPr>
                 <w:sz w:val="12"/>
                 <w:szCs w:val="12"/>
               </w:rPr>
-              <w:t>e.prod</w:t>
-            </w:r>
-            <w:proofErr w:type="gramEnd"/>
-            <w:r>
-              <w:rPr>
-                <w:sz w:val="12"/>
-                <w:szCs w:val="12"/>
-              </w:rPr>
-              <w:t>_in</w:t>
+              <w:t>e.prod_in</w:t>
             </w:r>
             <w:proofErr w:type="spellEnd"/>
             <w:r>
@@ -4081,7 +3911,6 @@
               <w:t>{{</w:t>
             </w:r>
             <w:proofErr w:type="spellStart"/>
-            <w:proofErr w:type="gramStart"/>
             <w:r>
               <w:rPr>
                 <w:sz w:val="12"/>
@@ -4090,7 +3919,6 @@
               <w:t>e.admin</w:t>
             </w:r>
             <w:proofErr w:type="spellEnd"/>
-            <w:proofErr w:type="gramEnd"/>
             <w:r>
               <w:rPr>
                 <w:sz w:val="12"/>
@@ -4295,103 +4123,31 @@
           <w:szCs w:val="14"/>
           <w:lang w:val="kk-KZ"/>
         </w:rPr>
-        <w:t>Наряд-</w:t>
-      </w:r>
-      <w:proofErr w:type="spellStart"/>
-      <w:r>
-        <w:rPr>
+        <w:t>Наряд-допуск сдал</w:t>
+      </w:r>
+      <w:r>
+        <w:rPr>
+          <w:sz w:val="14"/>
+          <w:szCs w:val="14"/>
+        </w:rPr>
+        <w:t>:</w:t>
+      </w:r>
+      <w:r>
+        <w:rPr>
+          <w:sz w:val="14"/>
+          <w:szCs w:val="14"/>
+        </w:rPr>
+        <w:t xml:space="preserve"> </w:t>
+      </w:r>
+      <w:r>
+        <w:rPr>
+          <w:b/>
+          <w:bCs/>
           <w:sz w:val="14"/>
           <w:szCs w:val="14"/>
           <w:lang w:val="kk-KZ"/>
         </w:rPr>
-        <w:t>допуск</w:t>
-      </w:r>
-      <w:proofErr w:type="spellEnd"/>
-      <w:r>
-        <w:rPr>
-          <w:sz w:val="14"/>
-          <w:szCs w:val="14"/>
-          <w:lang w:val="kk-KZ"/>
-        </w:rPr>
-        <w:t xml:space="preserve"> </w:t>
-      </w:r>
-      <w:proofErr w:type="spellStart"/>
-      <w:r>
-        <w:rPr>
-          <w:sz w:val="14"/>
-          <w:szCs w:val="14"/>
-          <w:lang w:val="kk-KZ"/>
-        </w:rPr>
-        <w:t>сдал</w:t>
-      </w:r>
-      <w:proofErr w:type="spellEnd"/>
-      <w:r>
-        <w:rPr>
-          <w:sz w:val="14"/>
-          <w:szCs w:val="14"/>
-        </w:rPr>
-        <w:t>:</w:t>
-      </w:r>
-      <w:r>
-        <w:rPr>
-          <w:sz w:val="14"/>
-          <w:szCs w:val="14"/>
-        </w:rPr>
-        <w:t xml:space="preserve"> </w:t>
-      </w:r>
-      <w:r>
-        <w:rPr>
-          <w:b/>
-          <w:bCs/>
-          <w:sz w:val="14"/>
-          <w:szCs w:val="14"/>
-          <w:lang w:val="kk-KZ"/>
-        </w:rPr>
-        <w:t>{{</w:t>
-      </w:r>
-      <w:proofErr w:type="spellStart"/>
-      <w:r>
-        <w:rPr>
-          <w:b/>
-          <w:bCs/>
-          <w:sz w:val="14"/>
-          <w:szCs w:val="14"/>
-          <w:lang w:val="kk-KZ"/>
-        </w:rPr>
-        <w:t>producer_name</w:t>
-      </w:r>
-      <w:proofErr w:type="spellEnd"/>
-      <w:r>
-        <w:rPr>
-          <w:b/>
-          <w:bCs/>
-          <w:sz w:val="14"/>
-          <w:szCs w:val="14"/>
-          <w:lang w:val="kk-KZ"/>
-        </w:rPr>
-        <w:t>}}, {{</w:t>
-      </w:r>
-      <w:proofErr w:type="spellStart"/>
-      <w:r>
-        <w:rPr>
-          <w:b/>
-          <w:bCs/>
-          <w:sz w:val="14"/>
-          <w:szCs w:val="14"/>
-          <w:lang w:val="kk-KZ"/>
-        </w:rPr>
-        <w:t>producer_job</w:t>
-      </w:r>
-      <w:proofErr w:type="spellEnd"/>
-      <w:r>
-        <w:rPr>
-          <w:b/>
-          <w:bCs/>
-          <w:sz w:val="14"/>
-          <w:szCs w:val="14"/>
-          <w:lang w:val="kk-KZ"/>
-        </w:rPr>
-        <w:t>}}</w:t>
+        <w:t>{{producer_name}}, {{producer_job}}</w:t>
       </w:r>
       <w:r>
         <w:rPr>
@@ -4424,67 +4180,7 @@
           <w:vertAlign w:val="superscript"/>
           <w:lang w:val="kk-KZ"/>
         </w:rPr>
-        <w:t>(</w:t>
-      </w:r>
-      <w:proofErr w:type="spellStart"/>
-      <w:r>
-        <w:rPr>
-          <w:sz w:val="14"/>
-          <w:szCs w:val="14"/>
-          <w:vertAlign w:val="superscript"/>
-          <w:lang w:val="kk-KZ"/>
-        </w:rPr>
-        <w:t>должность</w:t>
-      </w:r>
-      <w:proofErr w:type="spellEnd"/>
-      <w:r>
-        <w:rPr>
-          <w:sz w:val="14"/>
-          <w:szCs w:val="14"/>
-          <w:vertAlign w:val="superscript"/>
-          <w:lang w:val="kk-KZ"/>
-        </w:rPr>
-        <w:t>, Ф.И.О. (</w:t>
-      </w:r>
-      <w:proofErr w:type="spellStart"/>
-      <w:r>
-        <w:rPr>
-          <w:sz w:val="14"/>
-          <w:szCs w:val="14"/>
-          <w:vertAlign w:val="superscript"/>
-          <w:lang w:val="kk-KZ"/>
-        </w:rPr>
-        <w:t>при</w:t>
-      </w:r>
-      <w:proofErr w:type="spellEnd"/>
-      <w:r>
-        <w:rPr>
-          <w:sz w:val="14"/>
-          <w:szCs w:val="14"/>
-          <w:vertAlign w:val="superscript"/>
-          <w:lang w:val="kk-KZ"/>
-        </w:rPr>
-        <w:t xml:space="preserve"> </w:t>
-      </w:r>
-      <w:proofErr w:type="spellStart"/>
-      <w:r>
-        <w:rPr>
-          <w:sz w:val="14"/>
-          <w:szCs w:val="14"/>
-          <w:vertAlign w:val="superscript"/>
-          <w:lang w:val="kk-KZ"/>
-        </w:rPr>
-        <w:t>его</w:t>
-      </w:r>
-      <w:proofErr w:type="spellEnd"/>
-      <w:r>
-        <w:rPr>
-          <w:sz w:val="14"/>
-          <w:szCs w:val="14"/>
-          <w:vertAlign w:val="superscript"/>
-          <w:lang w:val="kk-KZ"/>
-        </w:rPr>
-        <w:t xml:space="preserve"> наличии), </w:t>
+        <w:t xml:space="preserve">(должность, Ф.И.О. (при его наличии), </w:t>
       </w:r>
       <w:r>
         <w:rPr>
@@ -4546,51 +4242,7 @@
           <w:szCs w:val="14"/>
           <w:lang w:val="kk-KZ"/>
         </w:rPr>
-        <w:t>{{</w:t>
-      </w:r>
-      <w:proofErr w:type="spellStart"/>
-      <w:r>
-        <w:rPr>
-          <w:b/>
-          <w:color w:val="000000" w:themeColor="text1"/>
-          <w:sz w:val="14"/>
-          <w:szCs w:val="14"/>
-          <w:lang w:val="kk-KZ"/>
-        </w:rPr>
-        <w:t>admitting_name</w:t>
-      </w:r>
-      <w:proofErr w:type="spellEnd"/>
-      <w:r>
-        <w:rPr>
-          <w:b/>
-          <w:color w:val="000000" w:themeColor="text1"/>
-          <w:sz w:val="14"/>
-          <w:szCs w:val="14"/>
-          <w:lang w:val="kk-KZ"/>
-        </w:rPr>
-        <w:t>}}, {{</w:t>
-      </w:r>
-      <w:proofErr w:type="spellStart"/>
-      <w:r>
-        <w:rPr>
-          <w:b/>
-          <w:color w:val="000000" w:themeColor="text1"/>
-          <w:sz w:val="14"/>
-          <w:szCs w:val="14"/>
-          <w:lang w:val="kk-KZ"/>
-        </w:rPr>
-        <w:t>admitting_job</w:t>
-      </w:r>
-      <w:proofErr w:type="spellEnd"/>
-      <w:r>
-        <w:rPr>
-          <w:b/>
-          <w:color w:val="000000" w:themeColor="text1"/>
-          <w:sz w:val="14"/>
-          <w:szCs w:val="14"/>
-          <w:lang w:val="kk-KZ"/>
-        </w:rPr>
-        <w:t>}}</w:t>
+        <w:t>{{admitting_name}}, {{admitting_job}}</w:t>
       </w:r>
     </w:p>
     <w:p>
@@ -4613,7 +4265,6 @@
         </w:rPr>
         <w:t>(</w:t>
       </w:r>
-      <w:proofErr w:type="spellStart"/>
       <w:r>
         <w:rPr>
           <w:sz w:val="14"/>
@@ -4621,77 +4272,7 @@
           <w:vertAlign w:val="superscript"/>
           <w:lang w:val="kk-KZ"/>
         </w:rPr>
-        <w:t>должность</w:t>
-      </w:r>
-      <w:proofErr w:type="spellEnd"/>
-      <w:r>
-        <w:rPr>
-          <w:sz w:val="14"/>
-          <w:szCs w:val="14"/>
-          <w:vertAlign w:val="superscript"/>
-          <w:lang w:val="kk-KZ"/>
-        </w:rPr>
-        <w:t>, Ф.И.О.(</w:t>
-      </w:r>
-      <w:proofErr w:type="spellStart"/>
-      <w:r>
-        <w:rPr>
-          <w:sz w:val="14"/>
-          <w:szCs w:val="14"/>
-          <w:vertAlign w:val="superscript"/>
-          <w:lang w:val="kk-KZ"/>
-        </w:rPr>
-        <w:t>при</w:t>
-      </w:r>
-      <w:proofErr w:type="spellEnd"/>
-      <w:r>
-        <w:rPr>
-          <w:sz w:val="14"/>
-          <w:szCs w:val="14"/>
-          <w:vertAlign w:val="superscript"/>
-          <w:lang w:val="kk-KZ"/>
-        </w:rPr>
-        <w:t xml:space="preserve"> </w:t>
-      </w:r>
-      <w:proofErr w:type="spellStart"/>
-      <w:r>
-        <w:rPr>
-          <w:sz w:val="14"/>
-          <w:szCs w:val="14"/>
-          <w:vertAlign w:val="superscript"/>
-          <w:lang w:val="kk-KZ"/>
-        </w:rPr>
-        <w:t>его</w:t>
-      </w:r>
-      <w:proofErr w:type="spellEnd"/>
-      <w:r>
-        <w:rPr>
-          <w:sz w:val="14"/>
-          <w:szCs w:val="14"/>
-          <w:vertAlign w:val="superscript"/>
-          <w:lang w:val="kk-KZ"/>
-        </w:rPr>
-        <w:t xml:space="preserve"> </w:t>
-      </w:r>
-      <w:proofErr w:type="spellStart"/>
-      <w:r>
-        <w:rPr>
-          <w:sz w:val="14"/>
-          <w:szCs w:val="14"/>
-          <w:vertAlign w:val="superscript"/>
-          <w:lang w:val="kk-KZ"/>
-        </w:rPr>
-        <w:t>наличии</w:t>
-      </w:r>
-      <w:proofErr w:type="spellEnd"/>
-      <w:r>
-        <w:rPr>
-          <w:sz w:val="14"/>
-          <w:szCs w:val="14"/>
-          <w:vertAlign w:val="superscript"/>
-          <w:lang w:val="kk-KZ"/>
-        </w:rPr>
-        <w:t xml:space="preserve">), </w:t>
+        <w:t xml:space="preserve">должность, Ф.И.О.(при его наличии), </w:t>
       </w:r>
       <w:r>
         <w:rPr>
@@ -4738,7 +4319,7 @@
 </file>
 
 <file path=word/endnotes.xml><?xml version="1.0" encoding="utf-8"?>
-<w:endnotes xmlns:wpc="http://schemas.microsoft.com/office/word/2010/wordprocessingCanvas" xmlns:cx="http://schemas.microsoft.com/office/drawing/2014/chartex" xmlns:cx1="http://schemas.microsoft.com/office/drawing/2015/9/8/chartex" xmlns:cx2="http://schemas.microsoft.com/office/drawing/2015/10/21/chartex" xmlns:cx3="http://schemas.microsoft.com/office/drawing/2016/5/9/chartex" xmlns:cx4="http://schemas.microsoft.com/office/drawing/2016/5/10/chartex" xmlns:cx5="http://schemas.microsoft.com/office/drawing/2016/5/11/chartex" xmlns:cx6="http://schemas.microsoft.com/office/drawing/2016/5/12/chartex" xmlns:cx7="http://schemas.microsoft.com/office/drawing/2016/5/13/chartex" xmlns:cx8="http://schemas.microsoft.com/office/drawing/2016/5/14/chartex" xmlns:mc="http://schemas.openxmlformats.org/markup-compatibility/2006" xmlns:aink="http://schemas.microsoft.com/office/drawing/2016/ink" xmlns:am3d="http://schemas.microsoft.com/office/drawing/2017/model3d" xmlns:o="urn:schemas-microsoft-com:office:office" xmlns:r="http://schemas.openxmlformats.org/officeDocument/2006/relationships" xmlns:m="http://schemas.openxmlformats.org/officeDocument/2006/math" xmlns:v="urn:schemas-microsoft-com:vml" xmlns:wp14="http://schemas.microsoft.com/office/word/2010/wordprocessingDrawing" xmlns:wp="http://schemas.openxmlformats.org/drawingml/2006/wordprocessingDrawing" xmlns:w10="urn:schemas-microsoft-com:office:word" xmlns:w="http://schemas.openxmlformats.org/wordprocessingml/2006/main" xmlns:w14="http://schemas.microsoft.com/office/word/2010/wordml" xmlns:w15="http://schemas.microsoft.com/office/word/2012/wordml" xmlns:w16cex="http://schemas.microsoft.com/office/word/2018/wordml/cex" xmlns:w16cid="http://schemas.microsoft.com/office/word/2016/wordml/cid" xmlns:w16="http://schemas.microsoft.com/office/word/2018/wordml" xmlns:w16sdtdh="http://schemas.microsoft.com/office/word/2020/wordml/sdtdatahash" xmlns:w16se="http://schemas.microsoft.com/office/word/2015/wordml/symex" xmlns:wpg="http://schemas.microsoft.com/office/word/2010/wordprocessingGroup" xmlns:wpi="http://schemas.microsoft.com/office/word/2010/wordprocessingInk" xmlns:wne="http://schemas.microsoft.com/office/word/2006/wordml" xmlns:wps="http://schemas.microsoft.com/office/word/2010/wordprocessingShape" mc:Ignorable="w14 w15 w16se w16cid w16 w16cex w16sdtdh wp14">
+<w:endnotes xmlns:wpc="http://schemas.microsoft.com/office/word/2010/wordprocessingCanvas" xmlns:cx="http://schemas.microsoft.com/office/drawing/2014/chartex" xmlns:mc="http://schemas.openxmlformats.org/markup-compatibility/2006" xmlns:o="urn:schemas-microsoft-com:office:office" xmlns:r="http://schemas.openxmlformats.org/officeDocument/2006/relationships" xmlns:m="http://schemas.openxmlformats.org/officeDocument/2006/math" xmlns:v="urn:schemas-microsoft-com:vml" xmlns:wp14="http://schemas.microsoft.com/office/word/2010/wordprocessingDrawing" xmlns:wp="http://schemas.openxmlformats.org/drawingml/2006/wordprocessingDrawing" xmlns:w10="urn:schemas-microsoft-com:office:word" xmlns:w="http://schemas.openxmlformats.org/wordprocessingml/2006/main" xmlns:w14="http://schemas.microsoft.com/office/word/2010/wordml" xmlns:w15="http://schemas.microsoft.com/office/word/2012/wordml" xmlns:w16se="http://schemas.microsoft.com/office/word/2015/wordml/symex" xmlns:wpg="http://schemas.microsoft.com/office/word/2010/wordprocessingGroup" xmlns:wpi="http://schemas.microsoft.com/office/word/2010/wordprocessingInk" xmlns:wne="http://schemas.microsoft.com/office/word/2006/wordml" xmlns:wps="http://schemas.microsoft.com/office/word/2010/wordprocessingShape" mc:Ignorable="w14 w15 w16se wp14">
   <w:endnote w:type="separator" w:id="-1">
     <w:p>
       <w:r>
@@ -4757,7 +4338,7 @@
 </file>
 
 <file path=word/footer1.xml><?xml version="1.0" encoding="utf-8"?>
-<w:ftr xmlns:wpc="http://schemas.microsoft.com/office/word/2010/wordprocessingCanvas" xmlns:cx="http://schemas.microsoft.com/office/drawing/2014/chartex" xmlns:cx1="http://schemas.microsoft.com/office/drawing/2015/9/8/chartex" xmlns:cx2="http://schemas.microsoft.com/office/drawing/2015/10/21/chartex" xmlns:cx3="http://schemas.microsoft.com/office/drawing/2016/5/9/chartex" xmlns:cx4="http://schemas.microsoft.com/office/drawing/2016/5/10/chartex" xmlns:cx5="http://schemas.microsoft.com/office/drawing/2016/5/11/chartex" xmlns:cx6="http://schemas.microsoft.com/office/drawing/2016/5/12/chartex" xmlns:cx7="http://schemas.microsoft.com/office/drawing/2016/5/13/chartex" xmlns:cx8="http://schemas.microsoft.com/office/drawing/2016/5/14/chartex" xmlns:mc="http://schemas.openxmlformats.org/markup-compatibility/2006" xmlns:aink="http://schemas.microsoft.com/office/drawing/2016/ink" xmlns:am3d="http://schemas.microsoft.com/office/drawing/2017/model3d" xmlns:o="urn:schemas-microsoft-com:office:office" xmlns:r="http://schemas.openxmlformats.org/officeDocument/2006/relationships" xmlns:m="http://schemas.openxmlformats.org/officeDocument/2006/math" xmlns:v="urn:schemas-microsoft-com:vml" xmlns:wp14="http://schemas.microsoft.com/office/word/2010/wordprocessingDrawing" xmlns:wp="http://schemas.openxmlformats.org/drawingml/2006/wordprocessingDrawing" xmlns:w10="urn:schemas-microsoft-com:office:word" xmlns:w="http://schemas.openxmlformats.org/wordprocessingml/2006/main" xmlns:w14="http://schemas.microsoft.com/office/word/2010/wordml" xmlns:w15="http://schemas.microsoft.com/office/word/2012/wordml" xmlns:w16cex="http://schemas.microsoft.com/office/word/2018/wordml/cex" xmlns:w16cid="http://schemas.microsoft.com/office/word/2016/wordml/cid" xmlns:w16="http://schemas.microsoft.com/office/word/2018/wordml" xmlns:w16sdtdh="http://schemas.microsoft.com/office/word/2020/wordml/sdtdatahash" xmlns:w16se="http://schemas.microsoft.com/office/word/2015/wordml/symex" xmlns:wpg="http://schemas.microsoft.com/office/word/2010/wordprocessingGroup" xmlns:wpi="http://schemas.microsoft.com/office/word/2010/wordprocessingInk" xmlns:wne="http://schemas.microsoft.com/office/word/2006/wordml" xmlns:wps="http://schemas.microsoft.com/office/word/2010/wordprocessingShape" mc:Ignorable="w14 w15 w16se w16cid w16 w16cex w16sdtdh wp14">
+<w:ftr xmlns:wpc="http://schemas.microsoft.com/office/word/2010/wordprocessingCanvas" xmlns:cx="http://schemas.microsoft.com/office/drawing/2014/chartex" xmlns:mc="http://schemas.openxmlformats.org/markup-compatibility/2006" xmlns:o="urn:schemas-microsoft-com:office:office" xmlns:r="http://schemas.openxmlformats.org/officeDocument/2006/relationships" xmlns:m="http://schemas.openxmlformats.org/officeDocument/2006/math" xmlns:v="urn:schemas-microsoft-com:vml" xmlns:wp14="http://schemas.microsoft.com/office/word/2010/wordprocessingDrawing" xmlns:wp="http://schemas.openxmlformats.org/drawingml/2006/wordprocessingDrawing" xmlns:w10="urn:schemas-microsoft-com:office:word" xmlns:w="http://schemas.openxmlformats.org/wordprocessingml/2006/main" xmlns:w14="http://schemas.microsoft.com/office/word/2010/wordml" xmlns:w15="http://schemas.microsoft.com/office/word/2012/wordml" xmlns:w16se="http://schemas.microsoft.com/office/word/2015/wordml/symex" xmlns:wpg="http://schemas.microsoft.com/office/word/2010/wordprocessingGroup" xmlns:wpi="http://schemas.microsoft.com/office/word/2010/wordprocessingInk" xmlns:wne="http://schemas.microsoft.com/office/word/2006/wordml" xmlns:wps="http://schemas.microsoft.com/office/word/2010/wordprocessingShape" mc:Ignorable="w14 w15 w16se wp14">
   <w:p>
     <w:pPr>
       <w:pStyle w:val="a8"/>
@@ -4787,7 +4368,7 @@
 </file>
 
 <file path=word/footer2.xml><?xml version="1.0" encoding="utf-8"?>
-<w:ftr xmlns:wpc="http://schemas.microsoft.com/office/word/2010/wordprocessingCanvas" xmlns:cx="http://schemas.microsoft.com/office/drawing/2014/chartex" xmlns:cx1="http://schemas.microsoft.com/office/drawing/2015/9/8/chartex" xmlns:cx2="http://schemas.microsoft.com/office/drawing/2015/10/21/chartex" xmlns:cx3="http://schemas.microsoft.com/office/drawing/2016/5/9/chartex" xmlns:cx4="http://schemas.microsoft.com/office/drawing/2016/5/10/chartex" xmlns:cx5="http://schemas.microsoft.com/office/drawing/2016/5/11/chartex" xmlns:cx6="http://schemas.microsoft.com/office/drawing/2016/5/12/chartex" xmlns:cx7="http://schemas.microsoft.com/office/drawing/2016/5/13/chartex" xmlns:cx8="http://schemas.microsoft.com/office/drawing/2016/5/14/chartex" xmlns:mc="http://schemas.openxmlformats.org/markup-compatibility/2006" xmlns:aink="http://schemas.microsoft.com/office/drawing/2016/ink" xmlns:am3d="http://schemas.microsoft.com/office/drawing/2017/model3d" xmlns:o="urn:schemas-microsoft-com:office:office" xmlns:r="http://schemas.openxmlformats.org/officeDocument/2006/relationships" xmlns:m="http://schemas.openxmlformats.org/officeDocument/2006/math" xmlns:v="urn:schemas-microsoft-com:vml" xmlns:wp14="http://schemas.microsoft.com/office/word/2010/wordprocessingDrawing" xmlns:wp="http://schemas.openxmlformats.org/drawingml/2006/wordprocessingDrawing" xmlns:w10="urn:schemas-microsoft-com:office:word" xmlns:w="http://schemas.openxmlformats.org/wordprocessingml/2006/main" xmlns:w14="http://schemas.microsoft.com/office/word/2010/wordml" xmlns:w15="http://schemas.microsoft.com/office/word/2012/wordml" xmlns:w16cex="http://schemas.microsoft.com/office/word/2018/wordml/cex" xmlns:w16cid="http://schemas.microsoft.com/office/word/2016/wordml/cid" xmlns:w16="http://schemas.microsoft.com/office/word/2018/wordml" xmlns:w16sdtdh="http://schemas.microsoft.com/office/word/2020/wordml/sdtdatahash" xmlns:w16se="http://schemas.microsoft.com/office/word/2015/wordml/symex" xmlns:wpg="http://schemas.microsoft.com/office/word/2010/wordprocessingGroup" xmlns:wpi="http://schemas.microsoft.com/office/word/2010/wordprocessingInk" xmlns:wne="http://schemas.microsoft.com/office/word/2006/wordml" xmlns:wps="http://schemas.microsoft.com/office/word/2010/wordprocessingShape" mc:Ignorable="w14 w15 w16se w16cid w16 w16cex w16sdtdh wp14">
+<w:ftr xmlns:wpc="http://schemas.microsoft.com/office/word/2010/wordprocessingCanvas" xmlns:cx="http://schemas.microsoft.com/office/drawing/2014/chartex" xmlns:mc="http://schemas.openxmlformats.org/markup-compatibility/2006" xmlns:o="urn:schemas-microsoft-com:office:office" xmlns:r="http://schemas.openxmlformats.org/officeDocument/2006/relationships" xmlns:m="http://schemas.openxmlformats.org/officeDocument/2006/math" xmlns:v="urn:schemas-microsoft-com:vml" xmlns:wp14="http://schemas.microsoft.com/office/word/2010/wordprocessingDrawing" xmlns:wp="http://schemas.openxmlformats.org/drawingml/2006/wordprocessingDrawing" xmlns:w10="urn:schemas-microsoft-com:office:word" xmlns:w="http://schemas.openxmlformats.org/wordprocessingml/2006/main" xmlns:w14="http://schemas.microsoft.com/office/word/2010/wordml" xmlns:w15="http://schemas.microsoft.com/office/word/2012/wordml" xmlns:w16se="http://schemas.microsoft.com/office/word/2015/wordml/symex" xmlns:wpg="http://schemas.microsoft.com/office/word/2010/wordprocessingGroup" xmlns:wpi="http://schemas.microsoft.com/office/word/2010/wordprocessingInk" xmlns:wne="http://schemas.microsoft.com/office/word/2006/wordml" xmlns:wps="http://schemas.microsoft.com/office/word/2010/wordprocessingShape" mc:Ignorable="w14 w15 w16se wp14">
   <w:p>
     <w:pPr>
       <w:pStyle w:val="a8"/>
@@ -4805,7 +4386,7 @@
 </file>
 
 <file path=word/footnotes.xml><?xml version="1.0" encoding="utf-8"?>
-<w:footnotes xmlns:wpc="http://schemas.microsoft.com/office/word/2010/wordprocessingCanvas" xmlns:cx="http://schemas.microsoft.com/office/drawing/2014/chartex" xmlns:cx1="http://schemas.microsoft.com/office/drawing/2015/9/8/chartex" xmlns:cx2="http://schemas.microsoft.com/office/drawing/2015/10/21/chartex" xmlns:cx3="http://schemas.microsoft.com/office/drawing/2016/5/9/chartex" xmlns:cx4="http://schemas.microsoft.com/office/drawing/2016/5/10/chartex" xmlns:cx5="http://schemas.microsoft.com/office/drawing/2016/5/11/chartex" xmlns:cx6="http://schemas.microsoft.com/office/drawing/2016/5/12/chartex" xmlns:cx7="http://schemas.microsoft.com/office/drawing/2016/5/13/chartex" xmlns:cx8="http://schemas.microsoft.com/office/drawing/2016/5/14/chartex" xmlns:mc="http://schemas.openxmlformats.org/markup-compatibility/2006" xmlns:aink="http://schemas.microsoft.com/office/drawing/2016/ink" xmlns:am3d="http://schemas.microsoft.com/office/drawing/2017/model3d" xmlns:o="urn:schemas-microsoft-com:office:office" xmlns:r="http://schemas.openxmlformats.org/officeDocument/2006/relationships" xmlns:m="http://schemas.openxmlformats.org/officeDocument/2006/math" xmlns:v="urn:schemas-microsoft-com:vml" xmlns:wp14="http://schemas.microsoft.com/office/word/2010/wordprocessingDrawing" xmlns:wp="http://schemas.openxmlformats.org/drawingml/2006/wordprocessingDrawing" xmlns:w10="urn:schemas-microsoft-com:office:word" xmlns:w="http://schemas.openxmlformats.org/wordprocessingml/2006/main" xmlns:w14="http://schemas.microsoft.com/office/word/2010/wordml" xmlns:w15="http://schemas.microsoft.com/office/word/2012/wordml" xmlns:w16cex="http://schemas.microsoft.com/office/word/2018/wordml/cex" xmlns:w16cid="http://schemas.microsoft.com/office/word/2016/wordml/cid" xmlns:w16="http://schemas.microsoft.com/office/word/2018/wordml" xmlns:w16sdtdh="http://schemas.microsoft.com/office/word/2020/wordml/sdtdatahash" xmlns:w16se="http://schemas.microsoft.com/office/word/2015/wordml/symex" xmlns:wpg="http://schemas.microsoft.com/office/word/2010/wordprocessingGroup" xmlns:wpi="http://schemas.microsoft.com/office/word/2010/wordprocessingInk" xmlns:wne="http://schemas.microsoft.com/office/word/2006/wordml" xmlns:wps="http://schemas.microsoft.com/office/word/2010/wordprocessingShape" mc:Ignorable="w14 w15 w16se w16cid w16 w16cex w16sdtdh wp14">
+<w:footnotes xmlns:wpc="http://schemas.microsoft.com/office/word/2010/wordprocessingCanvas" xmlns:cx="http://schemas.microsoft.com/office/drawing/2014/chartex" xmlns:mc="http://schemas.openxmlformats.org/markup-compatibility/2006" xmlns:o="urn:schemas-microsoft-com:office:office" xmlns:r="http://schemas.openxmlformats.org/officeDocument/2006/relationships" xmlns:m="http://schemas.openxmlformats.org/officeDocument/2006/math" xmlns:v="urn:schemas-microsoft-com:vml" xmlns:wp14="http://schemas.microsoft.com/office/word/2010/wordprocessingDrawing" xmlns:wp="http://schemas.openxmlformats.org/drawingml/2006/wordprocessingDrawing" xmlns:w10="urn:schemas-microsoft-com:office:word" xmlns:w="http://schemas.openxmlformats.org/wordprocessingml/2006/main" xmlns:w14="http://schemas.microsoft.com/office/word/2010/wordml" xmlns:w15="http://schemas.microsoft.com/office/word/2012/wordml" xmlns:w16se="http://schemas.microsoft.com/office/word/2015/wordml/symex" xmlns:wpg="http://schemas.microsoft.com/office/word/2010/wordprocessingGroup" xmlns:wpi="http://schemas.microsoft.com/office/word/2010/wordprocessingInk" xmlns:wne="http://schemas.microsoft.com/office/word/2006/wordml" xmlns:wps="http://schemas.microsoft.com/office/word/2010/wordprocessingShape" mc:Ignorable="w14 w15 w16se wp14">
   <w:footnote w:type="separator" w:id="-1">
     <w:p>
       <w:r>
@@ -4824,7 +4405,7 @@
 </file>
 
 <file path=word/header1.xml><?xml version="1.0" encoding="utf-8"?>
-<w:hdr xmlns:wpc="http://schemas.microsoft.com/office/word/2010/wordprocessingCanvas" xmlns:cx="http://schemas.microsoft.com/office/drawing/2014/chartex" xmlns:cx1="http://schemas.microsoft.com/office/drawing/2015/9/8/chartex" xmlns:cx2="http://schemas.microsoft.com/office/drawing/2015/10/21/chartex" xmlns:cx3="http://schemas.microsoft.com/office/drawing/2016/5/9/chartex" xmlns:cx4="http://schemas.microsoft.com/office/drawing/2016/5/10/chartex" xmlns:cx5="http://schemas.microsoft.com/office/drawing/2016/5/11/chartex" xmlns:cx6="http://schemas.microsoft.com/office/drawing/2016/5/12/chartex" xmlns:cx7="http://schemas.microsoft.com/office/drawing/2016/5/13/chartex" xmlns:cx8="http://schemas.microsoft.com/office/drawing/2016/5/14/chartex" xmlns:mc="http://schemas.openxmlformats.org/markup-compatibility/2006" xmlns:aink="http://schemas.microsoft.com/office/drawing/2016/ink" xmlns:am3d="http://schemas.microsoft.com/office/drawing/2017/model3d" xmlns:o="urn:schemas-microsoft-com:office:office" xmlns:r="http://schemas.openxmlformats.org/officeDocument/2006/relationships" xmlns:m="http://schemas.openxmlformats.org/officeDocument/2006/math" xmlns:v="urn:schemas-microsoft-com:vml" xmlns:wp14="http://schemas.microsoft.com/office/word/2010/wordprocessingDrawing" xmlns:wp="http://schemas.openxmlformats.org/drawingml/2006/wordprocessingDrawing" xmlns:w10="urn:schemas-microsoft-com:office:word" xmlns:w="http://schemas.openxmlformats.org/wordprocessingml/2006/main" xmlns:w14="http://schemas.microsoft.com/office/word/2010/wordml" xmlns:w15="http://schemas.microsoft.com/office/word/2012/wordml" xmlns:w16cex="http://schemas.microsoft.com/office/word/2018/wordml/cex" xmlns:w16cid="http://schemas.microsoft.com/office/word/2016/wordml/cid" xmlns:w16="http://schemas.microsoft.com/office/word/2018/wordml" xmlns:w16sdtdh="http://schemas.microsoft.com/office/word/2020/wordml/sdtdatahash" xmlns:w16se="http://schemas.microsoft.com/office/word/2015/wordml/symex" xmlns:wpg="http://schemas.microsoft.com/office/word/2010/wordprocessingGroup" xmlns:wpi="http://schemas.microsoft.com/office/word/2010/wordprocessingInk" xmlns:wne="http://schemas.microsoft.com/office/word/2006/wordml" xmlns:wps="http://schemas.microsoft.com/office/word/2010/wordprocessingShape" mc:Ignorable="w14 w15 w16se w16cid w16 w16cex w16sdtdh wp14">
+<w:hdr xmlns:wpc="http://schemas.microsoft.com/office/word/2010/wordprocessingCanvas" xmlns:cx="http://schemas.microsoft.com/office/drawing/2014/chartex" xmlns:mc="http://schemas.openxmlformats.org/markup-compatibility/2006" xmlns:o="urn:schemas-microsoft-com:office:office" xmlns:r="http://schemas.openxmlformats.org/officeDocument/2006/relationships" xmlns:m="http://schemas.openxmlformats.org/officeDocument/2006/math" xmlns:v="urn:schemas-microsoft-com:vml" xmlns:wp14="http://schemas.microsoft.com/office/word/2010/wordprocessingDrawing" xmlns:wp="http://schemas.openxmlformats.org/drawingml/2006/wordprocessingDrawing" xmlns:w10="urn:schemas-microsoft-com:office:word" xmlns:w="http://schemas.openxmlformats.org/wordprocessingml/2006/main" xmlns:w14="http://schemas.microsoft.com/office/word/2010/wordml" xmlns:w15="http://schemas.microsoft.com/office/word/2012/wordml" xmlns:w16se="http://schemas.microsoft.com/office/word/2015/wordml/symex" xmlns:wpg="http://schemas.microsoft.com/office/word/2010/wordprocessingGroup" xmlns:wpi="http://schemas.microsoft.com/office/word/2010/wordprocessingInk" xmlns:wne="http://schemas.microsoft.com/office/word/2006/wordml" xmlns:wps="http://schemas.microsoft.com/office/word/2010/wordprocessingShape" mc:Ignorable="w14 w15 w16se wp14">
   <w:p>
     <w:pPr>
       <w:pStyle w:val="a6"/>
@@ -4886,7 +4467,7 @@
 </file>
 
 <file path=word/header2.xml><?xml version="1.0" encoding="utf-8"?>
-<w:hdr xmlns:wpc="http://schemas.microsoft.com/office/word/2010/wordprocessingCanvas" xmlns:cx="http://schemas.microsoft.com/office/drawing/2014/chartex" xmlns:cx1="http://schemas.microsoft.com/office/drawing/2015/9/8/chartex" xmlns:cx2="http://schemas.microsoft.com/office/drawing/2015/10/21/chartex" xmlns:cx3="http://schemas.microsoft.com/office/drawing/2016/5/9/chartex" xmlns:cx4="http://schemas.microsoft.com/office/drawing/2016/5/10/chartex" xmlns:cx5="http://schemas.microsoft.com/office/drawing/2016/5/11/chartex" xmlns:cx6="http://schemas.microsoft.com/office/drawing/2016/5/12/chartex" xmlns:cx7="http://schemas.microsoft.com/office/drawing/2016/5/13/chartex" xmlns:cx8="http://schemas.microsoft.com/office/drawing/2016/5/14/chartex" xmlns:mc="http://schemas.openxmlformats.org/markup-compatibility/2006" xmlns:aink="http://schemas.microsoft.com/office/drawing/2016/ink" xmlns:am3d="http://schemas.microsoft.com/office/drawing/2017/model3d" xmlns:o="urn:schemas-microsoft-com:office:office" xmlns:r="http://schemas.openxmlformats.org/officeDocument/2006/relationships" xmlns:m="http://schemas.openxmlformats.org/officeDocument/2006/math" xmlns:v="urn:schemas-microsoft-com:vml" xmlns:wp14="http://schemas.microsoft.com/office/word/2010/wordprocessingDrawing" xmlns:wp="http://schemas.openxmlformats.org/drawingml/2006/wordprocessingDrawing" xmlns:w10="urn:schemas-microsoft-com:office:word" xmlns:w="http://schemas.openxmlformats.org/wordprocessingml/2006/main" xmlns:w14="http://schemas.microsoft.com/office/word/2010/wordml" xmlns:w15="http://schemas.microsoft.com/office/word/2012/wordml" xmlns:w16cex="http://schemas.microsoft.com/office/word/2018/wordml/cex" xmlns:w16cid="http://schemas.microsoft.com/office/word/2016/wordml/cid" xmlns:w16="http://schemas.microsoft.com/office/word/2018/wordml" xmlns:w16sdtdh="http://schemas.microsoft.com/office/word/2020/wordml/sdtdatahash" xmlns:w16se="http://schemas.microsoft.com/office/word/2015/wordml/symex" xmlns:wpg="http://schemas.microsoft.com/office/word/2010/wordprocessingGroup" xmlns:wpi="http://schemas.microsoft.com/office/word/2010/wordprocessingInk" xmlns:wne="http://schemas.microsoft.com/office/word/2006/wordml" xmlns:wps="http://schemas.microsoft.com/office/word/2010/wordprocessingShape" mc:Ignorable="w14 w15 w16se w16cid w16 w16cex w16sdtdh wp14">
+<w:hdr xmlns:wpc="http://schemas.microsoft.com/office/word/2010/wordprocessingCanvas" xmlns:cx="http://schemas.microsoft.com/office/drawing/2014/chartex" xmlns:mc="http://schemas.openxmlformats.org/markup-compatibility/2006" xmlns:o="urn:schemas-microsoft-com:office:office" xmlns:r="http://schemas.openxmlformats.org/officeDocument/2006/relationships" xmlns:m="http://schemas.openxmlformats.org/officeDocument/2006/math" xmlns:v="urn:schemas-microsoft-com:vml" xmlns:wp14="http://schemas.microsoft.com/office/word/2010/wordprocessingDrawing" xmlns:wp="http://schemas.openxmlformats.org/drawingml/2006/wordprocessingDrawing" xmlns:w10="urn:schemas-microsoft-com:office:word" xmlns:w="http://schemas.openxmlformats.org/wordprocessingml/2006/main" xmlns:w14="http://schemas.microsoft.com/office/word/2010/wordml" xmlns:w15="http://schemas.microsoft.com/office/word/2012/wordml" xmlns:w16se="http://schemas.microsoft.com/office/word/2015/wordml/symex" xmlns:wpg="http://schemas.microsoft.com/office/word/2010/wordprocessingGroup" xmlns:wpi="http://schemas.microsoft.com/office/word/2010/wordprocessingInk" xmlns:wne="http://schemas.microsoft.com/office/word/2006/wordml" xmlns:wps="http://schemas.microsoft.com/office/word/2010/wordprocessingShape" mc:Ignorable="w14 w15 w16se wp14">
   <w:p>
     <w:pPr>
       <w:pStyle w:val="a6"/>
@@ -4964,7 +4545,7 @@
 </file>
 
 <file path=word/header3.xml><?xml version="1.0" encoding="utf-8"?>
-<w:hdr xmlns:wpc="http://schemas.microsoft.com/office/word/2010/wordprocessingCanvas" xmlns:cx="http://schemas.microsoft.com/office/drawing/2014/chartex" xmlns:cx1="http://schemas.microsoft.com/office/drawing/2015/9/8/chartex" xmlns:cx2="http://schemas.microsoft.com/office/drawing/2015/10/21/chartex" xmlns:cx3="http://schemas.microsoft.com/office/drawing/2016/5/9/chartex" xmlns:cx4="http://schemas.microsoft.com/office/drawing/2016/5/10/chartex" xmlns:cx5="http://schemas.microsoft.com/office/drawing/2016/5/11/chartex" xmlns:cx6="http://schemas.microsoft.com/office/drawing/2016/5/12/chartex" xmlns:cx7="http://schemas.microsoft.com/office/drawing/2016/5/13/chartex" xmlns:cx8="http://schemas.microsoft.com/office/drawing/2016/5/14/chartex" xmlns:mc="http://schemas.openxmlformats.org/markup-compatibility/2006" xmlns:aink="http://schemas.microsoft.com/office/drawing/2016/ink" xmlns:am3d="http://schemas.microsoft.com/office/drawing/2017/model3d" xmlns:o="urn:schemas-microsoft-com:office:office" xmlns:r="http://schemas.openxmlformats.org/officeDocument/2006/relationships" xmlns:m="http://schemas.openxmlformats.org/officeDocument/2006/math" xmlns:v="urn:schemas-microsoft-com:vml" xmlns:wp14="http://schemas.microsoft.com/office/word/2010/wordprocessingDrawing" xmlns:wp="http://schemas.openxmlformats.org/drawingml/2006/wordprocessingDrawing" xmlns:w10="urn:schemas-microsoft-com:office:word" xmlns:w="http://schemas.openxmlformats.org/wordprocessingml/2006/main" xmlns:w14="http://schemas.microsoft.com/office/word/2010/wordml" xmlns:w15="http://schemas.microsoft.com/office/word/2012/wordml" xmlns:w16cex="http://schemas.microsoft.com/office/word/2018/wordml/cex" xmlns:w16cid="http://schemas.microsoft.com/office/word/2016/wordml/cid" xmlns:w16="http://schemas.microsoft.com/office/word/2018/wordml" xmlns:w16sdtdh="http://schemas.microsoft.com/office/word/2020/wordml/sdtdatahash" xmlns:w16se="http://schemas.microsoft.com/office/word/2015/wordml/symex" xmlns:wpg="http://schemas.microsoft.com/office/word/2010/wordprocessingGroup" xmlns:wpi="http://schemas.microsoft.com/office/word/2010/wordprocessingInk" xmlns:wne="http://schemas.microsoft.com/office/word/2006/wordml" xmlns:wps="http://schemas.microsoft.com/office/word/2010/wordprocessingShape" mc:Ignorable="w14 w15 w16se w16cid w16 w16cex w16sdtdh wp14">
+<w:hdr xmlns:wpc="http://schemas.microsoft.com/office/word/2010/wordprocessingCanvas" xmlns:cx="http://schemas.microsoft.com/office/drawing/2014/chartex" xmlns:mc="http://schemas.openxmlformats.org/markup-compatibility/2006" xmlns:o="urn:schemas-microsoft-com:office:office" xmlns:r="http://schemas.openxmlformats.org/officeDocument/2006/relationships" xmlns:m="http://schemas.openxmlformats.org/officeDocument/2006/math" xmlns:v="urn:schemas-microsoft-com:vml" xmlns:wp14="http://schemas.microsoft.com/office/word/2010/wordprocessingDrawing" xmlns:wp="http://schemas.openxmlformats.org/drawingml/2006/wordprocessingDrawing" xmlns:w10="urn:schemas-microsoft-com:office:word" xmlns:w="http://schemas.openxmlformats.org/wordprocessingml/2006/main" xmlns:w14="http://schemas.microsoft.com/office/word/2010/wordml" xmlns:w15="http://schemas.microsoft.com/office/word/2012/wordml" xmlns:w16se="http://schemas.microsoft.com/office/word/2015/wordml/symex" xmlns:wpg="http://schemas.microsoft.com/office/word/2010/wordprocessingGroup" xmlns:wpi="http://schemas.microsoft.com/office/word/2010/wordprocessingInk" xmlns:wne="http://schemas.microsoft.com/office/word/2006/wordml" xmlns:wps="http://schemas.microsoft.com/office/word/2010/wordprocessingShape" mc:Ignorable="w14 w15 w16se wp14">
   <w:p>
     <w:pPr>
       <w:pStyle w:val="a6"/>
@@ -5026,7 +4607,7 @@
 </file>
 
 <file path=word/styles.xml><?xml version="1.0" encoding="utf-8"?>
-<w:styles xmlns:mc="http://schemas.openxmlformats.org/markup-compatibility/2006" xmlns:r="http://schemas.openxmlformats.org/officeDocument/2006/relationships" xmlns:w="http://schemas.openxmlformats.org/wordprocessingml/2006/main" xmlns:w14="http://schemas.microsoft.com/office/word/2010/wordml" xmlns:w15="http://schemas.microsoft.com/office/word/2012/wordml" xmlns:w16cex="http://schemas.microsoft.com/office/word/2018/wordml/cex" xmlns:w16cid="http://schemas.microsoft.com/office/word/2016/wordml/cid" xmlns:w16="http://schemas.microsoft.com/office/word/2018/wordml" xmlns:w16sdtdh="http://schemas.microsoft.com/office/word/2020/wordml/sdtdatahash" xmlns:w16se="http://schemas.microsoft.com/office/word/2015/wordml/symex" mc:Ignorable="w14 w15 w16se w16cid w16 w16cex w16sdtdh">
+<w:styles xmlns:mc="http://schemas.openxmlformats.org/markup-compatibility/2006" xmlns:r="http://schemas.openxmlformats.org/officeDocument/2006/relationships" xmlns:w="http://schemas.openxmlformats.org/wordprocessingml/2006/main" xmlns:w14="http://schemas.microsoft.com/office/word/2010/wordml" xmlns:w15="http://schemas.microsoft.com/office/word/2012/wordml" xmlns:w16se="http://schemas.microsoft.com/office/word/2015/wordml/symex" mc:Ignorable="w14 w15 w16se">
   <w:docDefaults>
     <w:rPrDefault>
       <w:rPr>
@@ -5040,7 +4621,7 @@
       </w:pPr>
     </w:pPrDefault>
   </w:docDefaults>
-  <w:latentStyles w:defLockedState="0" w:defUIPriority="0" w:defSemiHidden="0" w:defUnhideWhenUsed="0" w:defQFormat="0" w:count="376">
+  <w:latentStyles w:defLockedState="0" w:defUIPriority="0" w:defSemiHidden="0" w:defUnhideWhenUsed="0" w:defQFormat="0" w:count="371">
     <w:lsdException w:name="Normal" w:qFormat="1"/>
     <w:lsdException w:name="heading 1" w:qFormat="1"/>
     <w:lsdException w:name="heading 2" w:semiHidden="1" w:unhideWhenUsed="1" w:qFormat="1"/>
@@ -5322,11 +4903,6 @@
     <w:lsdException w:name="List Table 5 Dark Accent 6" w:uiPriority="50"/>
     <w:lsdException w:name="List Table 6 Colorful Accent 6" w:uiPriority="51"/>
     <w:lsdException w:name="List Table 7 Colorful Accent 6" w:uiPriority="52"/>
-    <w:lsdException w:name="Mention" w:semiHidden="1" w:uiPriority="99" w:unhideWhenUsed="1"/>
-    <w:lsdException w:name="Smart Hyperlink" w:semiHidden="1" w:uiPriority="99" w:unhideWhenUsed="1"/>
-    <w:lsdException w:name="Hashtag" w:semiHidden="1" w:uiPriority="99" w:unhideWhenUsed="1"/>
-    <w:lsdException w:name="Unresolved Mention" w:semiHidden="1" w:uiPriority="99" w:unhideWhenUsed="1"/>
-    <w:lsdException w:name="Smart Link" w:semiHidden="1" w:uiPriority="99" w:unhideWhenUsed="1"/>
   </w:latentStyles>
   <w:style w:type="paragraph" w:default="1" w:styleId="a">
     <w:name w:val="Normal"/>
@@ -5744,7 +5320,7 @@
 </file>
 
 <file path=customXml/itemProps1.xml><?xml version="1.0" encoding="utf-8"?>
-<ds:datastoreItem xmlns:ds="http://schemas.openxmlformats.org/officeDocument/2006/customXml" ds:itemID="{F1B8CC61-0940-420F-8080-B2F9617A4D25}">
+<ds:datastoreItem xmlns:ds="http://schemas.openxmlformats.org/officeDocument/2006/customXml" ds:itemID="{89658E5F-2359-4AC1-A790-1737128CA2C2}">
   <ds:schemaRefs>
     <ds:schemaRef ds:uri="http://schemas.openxmlformats.org/officeDocument/2006/bibliography"/>
   </ds:schemaRefs>

</xml_diff>

<commit_message>
Fix docx field 13 date_end, department from JSON data, rename producer label
Made-with: Cursor
</commit_message>
<xml_diff>
--- a/templates/docx/dangerous_permits_rus.docx
+++ b/templates/docx/dangerous_permits_rus.docx
@@ -23,13 +23,17 @@
       </w:r>
       <w:r>
         <w:rPr>
+          <w:rStyle w:val="s0"/>
           <w:b/>
           <w:bCs/>
           <w:sz w:val="16"/>
           <w:szCs w:val="16"/>
-        </w:rPr>
-        <w:t xml:space="preserve"> </w:t>
-      </w:r>
+          <w:lang w:val="en-US"/>
+        </w:rPr>
+        <w:t>:</w:t>
+      </w:r>
+      <w:bookmarkStart w:id="0" w:name="_GoBack"/>
+      <w:bookmarkEnd w:id="0"/>
       <w:r>
         <w:rPr>
           <w:b/>
@@ -37,9 +41,8 @@
           <w:sz w:val="16"/>
           <w:szCs w:val="16"/>
         </w:rPr>
-        <w:t>{{</w:t>
-      </w:r>
-      <w:proofErr w:type="spellStart"/>
+        <w:t xml:space="preserve"> </w:t>
+      </w:r>
       <w:r>
         <w:rPr>
           <w:b/>
@@ -47,17 +50,7 @@
           <w:sz w:val="16"/>
           <w:szCs w:val="16"/>
         </w:rPr>
-        <w:t>department</w:t>
-      </w:r>
-      <w:proofErr w:type="spellEnd"/>
-      <w:r>
-        <w:rPr>
-          <w:b/>
-          <w:bCs/>
-          <w:sz w:val="16"/>
-          <w:szCs w:val="16"/>
-        </w:rPr>
-        <w:t>}}</w:t>
+        <w:t>{{department}}</w:t>
       </w:r>
     </w:p>
     <w:p>
@@ -103,169 +96,83 @@
           <w:sz w:val="16"/>
           <w:szCs w:val="16"/>
         </w:rPr>
-        <w:t>{{</w:t>
-      </w:r>
-      <w:proofErr w:type="spellStart"/>
-      <w:r>
+        <w:t>{{permit_id}}</w:t>
+      </w:r>
+    </w:p>
+    <w:p>
+      <w:pPr>
+        <w:rPr>
+          <w:sz w:val="12"/>
+          <w:szCs w:val="12"/>
+        </w:rPr>
+      </w:pPr>
+    </w:p>
+    <w:p>
+      <w:pPr>
         <w:rPr>
           <w:b/>
           <w:bCs/>
-          <w:sz w:val="16"/>
-          <w:szCs w:val="16"/>
-        </w:rPr>
-        <w:t>permit_id</w:t>
-      </w:r>
-      <w:proofErr w:type="spellEnd"/>
+          <w:sz w:val="14"/>
+          <w:szCs w:val="14"/>
+          <w:lang w:val="en-US"/>
+        </w:rPr>
+      </w:pPr>
+      <w:r>
+        <w:rPr>
+          <w:sz w:val="14"/>
+          <w:szCs w:val="14"/>
+          <w:lang w:val="en-US"/>
+        </w:rPr>
+        <w:t xml:space="preserve">1. </w:t>
+      </w:r>
+      <w:r>
+        <w:rPr>
+          <w:sz w:val="14"/>
+          <w:szCs w:val="14"/>
+        </w:rPr>
+        <w:t>Производитель</w:t>
+      </w:r>
+      <w:r>
+        <w:rPr>
+          <w:sz w:val="14"/>
+          <w:szCs w:val="14"/>
+          <w:lang w:val="en-US"/>
+        </w:rPr>
+        <w:t xml:space="preserve"> </w:t>
+      </w:r>
+      <w:r>
+        <w:rPr>
+          <w:sz w:val="14"/>
+          <w:szCs w:val="14"/>
+        </w:rPr>
+        <w:t>работ</w:t>
+      </w:r>
+      <w:r>
+        <w:rPr>
+          <w:sz w:val="14"/>
+          <w:szCs w:val="14"/>
+          <w:lang w:val="en-US"/>
+        </w:rPr>
+        <w:t>:</w:t>
+      </w:r>
+      <w:r>
+        <w:rPr>
+          <w:color w:val="1F4E79"/>
+          <w:sz w:val="14"/>
+          <w:szCs w:val="14"/>
+          <w:lang w:val="kk-KZ"/>
+        </w:rPr>
+        <w:t xml:space="preserve"> </w:t>
+      </w:r>
       <w:r>
         <w:rPr>
           <w:b/>
           <w:bCs/>
-          <w:sz w:val="16"/>
-          <w:szCs w:val="16"/>
-        </w:rPr>
-        <w:t>}}</w:t>
-      </w:r>
-    </w:p>
-    <w:p>
-      <w:pPr>
-        <w:rPr>
-          <w:sz w:val="12"/>
-          <w:szCs w:val="12"/>
-        </w:rPr>
-      </w:pPr>
-    </w:p>
-    <w:p>
-      <w:pPr>
-        <w:rPr>
-          <w:b/>
-          <w:bCs/>
           <w:sz w:val="14"/>
           <w:szCs w:val="14"/>
           <w:lang w:val="en-US"/>
         </w:rPr>
-      </w:pPr>
-      <w:r>
-        <w:rPr>
-          <w:sz w:val="14"/>
-          <w:szCs w:val="14"/>
-          <w:lang w:val="en-US"/>
-        </w:rPr>
-        <w:t xml:space="preserve">1. </w:t>
-      </w:r>
-      <w:r>
-        <w:rPr>
-          <w:sz w:val="14"/>
-          <w:szCs w:val="14"/>
-        </w:rPr>
-        <w:t>Производитель</w:t>
-      </w:r>
-      <w:r>
-        <w:rPr>
-          <w:sz w:val="14"/>
-          <w:szCs w:val="14"/>
-          <w:lang w:val="en-US"/>
-        </w:rPr>
-        <w:t xml:space="preserve"> </w:t>
-      </w:r>
-      <w:r>
-        <w:rPr>
-          <w:sz w:val="14"/>
-          <w:szCs w:val="14"/>
-        </w:rPr>
-        <w:t>работ</w:t>
-      </w:r>
-      <w:r>
-        <w:rPr>
-          <w:sz w:val="14"/>
-          <w:szCs w:val="14"/>
-          <w:lang w:val="en-US"/>
-        </w:rPr>
-        <w:t>:</w:t>
-      </w:r>
-      <w:r>
-        <w:rPr>
-          <w:color w:val="1F4E79"/>
-          <w:sz w:val="14"/>
-          <w:szCs w:val="14"/>
-          <w:lang w:val="kk-KZ"/>
-        </w:rPr>
-        <w:t xml:space="preserve"> </w:t>
-      </w:r>
-      <w:r>
-        <w:rPr>
-          <w:b/>
-          <w:bCs/>
-          <w:sz w:val="14"/>
-          <w:szCs w:val="14"/>
-          <w:lang w:val="en-US"/>
-        </w:rPr>
-        <w:t>{{</w:t>
-      </w:r>
-      <w:proofErr w:type="spellStart"/>
-      <w:r>
-        <w:rPr>
-          <w:b/>
-          <w:bCs/>
-          <w:sz w:val="14"/>
-          <w:szCs w:val="14"/>
-          <w:lang w:val="en-US"/>
-        </w:rPr>
-        <w:t>producer_name</w:t>
-      </w:r>
-      <w:proofErr w:type="spellEnd"/>
-      <w:r>
-        <w:rPr>
-          <w:b/>
-          <w:bCs/>
-          <w:sz w:val="14"/>
-          <w:szCs w:val="14"/>
-          <w:lang w:val="en-US"/>
-        </w:rPr>
-        <w:t>}}, {{</w:t>
-      </w:r>
-      <w:proofErr w:type="spellStart"/>
-      <w:r>
-        <w:rPr>
-          <w:b/>
-          <w:bCs/>
-          <w:sz w:val="14"/>
-          <w:szCs w:val="14"/>
-          <w:lang w:val="en-US"/>
-        </w:rPr>
-        <w:t>producer_job</w:t>
-      </w:r>
-      <w:proofErr w:type="spellEnd"/>
-      <w:r>
-        <w:rPr>
-          <w:b/>
-          <w:bCs/>
-          <w:sz w:val="14"/>
-          <w:szCs w:val="14"/>
-          <w:lang w:val="en-US"/>
-        </w:rPr>
-        <w:t>}}, ({{</w:t>
-      </w:r>
-      <w:proofErr w:type="spellStart"/>
-      <w:r>
-        <w:rPr>
-          <w:b/>
-          <w:bCs/>
-          <w:sz w:val="14"/>
-          <w:szCs w:val="14"/>
-          <w:lang w:val="en-US"/>
-        </w:rPr>
-        <w:t>producer_date</w:t>
-      </w:r>
-      <w:proofErr w:type="spellEnd"/>
-      <w:r>
-        <w:rPr>
-          <w:b/>
-          <w:bCs/>
-          <w:sz w:val="14"/>
-          <w:szCs w:val="14"/>
-          <w:lang w:val="en-US"/>
-        </w:rPr>
-        <w:t>}})</w:t>
+        <w:t>{{producer_name}}, {{producer_job}}, ({{producer_date}})</w:t>
       </w:r>
     </w:p>
     <w:p>
@@ -361,7 +268,6 @@
         </w:rPr>
         <w:t xml:space="preserve"> </w:t>
       </w:r>
-      <w:proofErr w:type="gramStart"/>
       <w:r>
         <w:rPr>
           <w:b/>
@@ -370,9 +276,325 @@
           <w:sz w:val="14"/>
           <w:szCs w:val="14"/>
         </w:rPr>
-        <w:t xml:space="preserve">{{ </w:t>
-      </w:r>
-      <w:proofErr w:type="spellStart"/>
+        <w:t>{{ work_place }}, {{ work_name }}, {{ work_content }}</w:t>
+      </w:r>
+    </w:p>
+    <w:p>
+      <w:pPr>
+        <w:ind w:left="708" w:firstLine="708"/>
+        <w:rPr>
+          <w:sz w:val="12"/>
+          <w:szCs w:val="12"/>
+          <w:vertAlign w:val="superscript"/>
+        </w:rPr>
+      </w:pPr>
+      <w:r>
+        <w:rPr>
+          <w:sz w:val="12"/>
+          <w:szCs w:val="12"/>
+          <w:vertAlign w:val="superscript"/>
+        </w:rPr>
+        <w:t>(</w:t>
+      </w:r>
+      <w:r>
+        <w:rPr>
+          <w:rStyle w:val="s0"/>
+          <w:color w:val="auto"/>
+          <w:sz w:val="12"/>
+          <w:szCs w:val="12"/>
+          <w:vertAlign w:val="superscript"/>
+        </w:rPr>
+        <w:t>Место работы, наименование оборудования, краткое содержание объема работ)</w:t>
+      </w:r>
+    </w:p>
+    <w:p>
+      <w:pPr>
+        <w:rPr>
+          <w:sz w:val="14"/>
+          <w:szCs w:val="14"/>
+          <w:lang w:val="en-US"/>
+        </w:rPr>
+      </w:pPr>
+      <w:r>
+        <w:rPr>
+          <w:sz w:val="14"/>
+          <w:szCs w:val="14"/>
+          <w:lang w:val="en-US"/>
+        </w:rPr>
+        <w:t xml:space="preserve">3. </w:t>
+      </w:r>
+      <w:r>
+        <w:rPr>
+          <w:rStyle w:val="s0"/>
+          <w:sz w:val="14"/>
+          <w:szCs w:val="14"/>
+        </w:rPr>
+        <w:t>Допускающий</w:t>
+      </w:r>
+      <w:r>
+        <w:rPr>
+          <w:rStyle w:val="s0"/>
+          <w:sz w:val="14"/>
+          <w:szCs w:val="14"/>
+          <w:lang w:val="en-US"/>
+        </w:rPr>
+        <w:t>(</w:t>
+      </w:r>
+      <w:r>
+        <w:rPr>
+          <w:rStyle w:val="s0"/>
+          <w:sz w:val="14"/>
+          <w:szCs w:val="14"/>
+        </w:rPr>
+        <w:t>ие</w:t>
+      </w:r>
+      <w:r>
+        <w:rPr>
+          <w:rStyle w:val="s0"/>
+          <w:sz w:val="14"/>
+          <w:szCs w:val="14"/>
+          <w:lang w:val="en-US"/>
+        </w:rPr>
+        <w:t xml:space="preserve">) </w:t>
+      </w:r>
+      <w:r>
+        <w:rPr>
+          <w:rStyle w:val="s0"/>
+          <w:sz w:val="14"/>
+          <w:szCs w:val="14"/>
+        </w:rPr>
+        <w:t>к</w:t>
+      </w:r>
+      <w:r>
+        <w:rPr>
+          <w:rStyle w:val="s0"/>
+          <w:sz w:val="14"/>
+          <w:szCs w:val="14"/>
+          <w:lang w:val="en-US"/>
+        </w:rPr>
+        <w:t xml:space="preserve"> </w:t>
+      </w:r>
+      <w:r>
+        <w:rPr>
+          <w:rStyle w:val="s0"/>
+          <w:sz w:val="14"/>
+          <w:szCs w:val="14"/>
+        </w:rPr>
+        <w:t>работе</w:t>
+      </w:r>
+      <w:r>
+        <w:rPr>
+          <w:rStyle w:val="s0"/>
+          <w:sz w:val="14"/>
+          <w:szCs w:val="14"/>
+          <w:lang w:val="en-US"/>
+        </w:rPr>
+        <w:t>:</w:t>
+      </w:r>
+      <w:r>
+        <w:rPr>
+          <w:rStyle w:val="s0"/>
+          <w:sz w:val="14"/>
+          <w:szCs w:val="14"/>
+          <w:lang w:val="en-US"/>
+        </w:rPr>
+        <w:t xml:space="preserve"> </w:t>
+      </w:r>
+      <w:r>
+        <w:rPr>
+          <w:rStyle w:val="s0"/>
+          <w:b/>
+          <w:sz w:val="14"/>
+          <w:szCs w:val="14"/>
+          <w:lang w:val="en-US"/>
+        </w:rPr>
+        <w:t>{{admitting_name}},</w:t>
+      </w:r>
+      <w:r>
+        <w:rPr>
+          <w:rStyle w:val="s0"/>
+          <w:sz w:val="14"/>
+          <w:szCs w:val="14"/>
+          <w:lang w:val="en-US"/>
+        </w:rPr>
+        <w:t xml:space="preserve"> </w:t>
+      </w:r>
+      <w:r>
+        <w:rPr>
+          <w:b/>
+          <w:bCs/>
+          <w:sz w:val="14"/>
+          <w:szCs w:val="14"/>
+          <w:lang w:val="en-US"/>
+        </w:rPr>
+        <w:t>{{ admitting_job}}, ({{admitting_date}})</w:t>
+      </w:r>
+    </w:p>
+    <w:p>
+      <w:pPr>
+        <w:ind w:left="708" w:firstLine="708"/>
+        <w:rPr>
+          <w:sz w:val="12"/>
+          <w:szCs w:val="12"/>
+          <w:vertAlign w:val="superscript"/>
+        </w:rPr>
+      </w:pPr>
+      <w:r>
+        <w:rPr>
+          <w:sz w:val="12"/>
+          <w:szCs w:val="12"/>
+          <w:vertAlign w:val="superscript"/>
+        </w:rPr>
+        <w:t>(Ф.И.О. (при его наличии), должность)</w:t>
+      </w:r>
+    </w:p>
+    <w:p>
+      <w:pPr>
+        <w:rPr>
+          <w:b/>
+          <w:bCs/>
+          <w:sz w:val="14"/>
+          <w:szCs w:val="14"/>
+          <w:lang w:val="en-US"/>
+        </w:rPr>
+      </w:pPr>
+      <w:r>
+        <w:rPr>
+          <w:sz w:val="14"/>
+          <w:szCs w:val="14"/>
+          <w:lang w:val="en-US"/>
+        </w:rPr>
+        <w:t xml:space="preserve">4. </w:t>
+      </w:r>
+      <w:r>
+        <w:rPr>
+          <w:sz w:val="14"/>
+          <w:szCs w:val="14"/>
+        </w:rPr>
+        <w:t>Ответственный</w:t>
+      </w:r>
+      <w:r>
+        <w:rPr>
+          <w:sz w:val="14"/>
+          <w:szCs w:val="14"/>
+          <w:lang w:val="en-US"/>
+        </w:rPr>
+        <w:t xml:space="preserve"> </w:t>
+      </w:r>
+      <w:r>
+        <w:rPr>
+          <w:sz w:val="14"/>
+          <w:szCs w:val="14"/>
+        </w:rPr>
+        <w:t>руководитель</w:t>
+      </w:r>
+      <w:r>
+        <w:rPr>
+          <w:sz w:val="14"/>
+          <w:szCs w:val="14"/>
+          <w:lang w:val="en-US"/>
+        </w:rPr>
+        <w:t>:</w:t>
+      </w:r>
+      <w:r>
+        <w:rPr>
+          <w:color w:val="1F4E79"/>
+          <w:sz w:val="14"/>
+          <w:szCs w:val="14"/>
+          <w:lang w:val="en-US"/>
+        </w:rPr>
+        <w:t xml:space="preserve"> </w:t>
+      </w:r>
+      <w:r>
+        <w:rPr>
+          <w:b/>
+          <w:bCs/>
+          <w:sz w:val="14"/>
+          <w:szCs w:val="14"/>
+          <w:lang w:val="en-US"/>
+        </w:rPr>
+        <w:t>{{responsible_name}}, {{responsible_job}}, ({{responsible_date}})</w:t>
+      </w:r>
+    </w:p>
+    <w:p>
+      <w:pPr>
+        <w:ind w:left="708" w:firstLine="708"/>
+        <w:rPr>
+          <w:sz w:val="12"/>
+          <w:szCs w:val="12"/>
+          <w:vertAlign w:val="superscript"/>
+        </w:rPr>
+      </w:pPr>
+      <w:r>
+        <w:rPr>
+          <w:sz w:val="12"/>
+          <w:szCs w:val="12"/>
+          <w:vertAlign w:val="superscript"/>
+        </w:rPr>
+        <w:t>(Ф.И.О. (при его наличии),</w:t>
+      </w:r>
+      <w:r>
+        <w:rPr>
+          <w:sz w:val="12"/>
+          <w:szCs w:val="12"/>
+          <w:vertAlign w:val="superscript"/>
+        </w:rPr>
+        <w:t xml:space="preserve"> должность)</w:t>
+      </w:r>
+    </w:p>
+    <w:p>
+      <w:pPr>
+        <w:rPr>
+          <w:sz w:val="14"/>
+          <w:szCs w:val="14"/>
+        </w:rPr>
+      </w:pPr>
+      <w:r>
+        <w:rPr>
+          <w:sz w:val="14"/>
+          <w:szCs w:val="14"/>
+        </w:rPr>
+        <w:t xml:space="preserve">5. </w:t>
+      </w:r>
+      <w:r>
+        <w:rPr>
+          <w:rStyle w:val="s0"/>
+          <w:sz w:val="14"/>
+          <w:szCs w:val="14"/>
+        </w:rPr>
+        <w:t>Мероприятия для обеспечения безопасности работ</w:t>
+      </w:r>
+      <w:r>
+        <w:rPr>
+          <w:sz w:val="14"/>
+          <w:szCs w:val="14"/>
+        </w:rPr>
+        <w:t>:</w:t>
+      </w:r>
+    </w:p>
+    <w:p>
+      <w:pPr>
+        <w:rPr>
+          <w:color w:val="1F4E79"/>
+          <w:sz w:val="14"/>
+          <w:szCs w:val="14"/>
+        </w:rPr>
+      </w:pPr>
+      <w:r>
+        <w:rPr>
+          <w:sz w:val="14"/>
+          <w:szCs w:val="14"/>
+        </w:rPr>
+        <w:t>5.1. Остановить:</w:t>
+      </w:r>
+      <w:r>
+        <w:rPr>
+          <w:color w:val="1F4E79"/>
+          <w:sz w:val="14"/>
+          <w:szCs w:val="14"/>
+        </w:rPr>
+        <w:t xml:space="preserve"> </w:t>
+      </w:r>
       <w:r>
         <w:rPr>
           <w:b/>
@@ -381,556 +603,7 @@
           <w:sz w:val="14"/>
           <w:szCs w:val="14"/>
         </w:rPr>
-        <w:t>work</w:t>
-      </w:r>
-      <w:proofErr w:type="gramEnd"/>
-      <w:r>
-        <w:rPr>
-          <w:b/>
-          <w:bCs/>
-          <w:color w:val="000000"/>
-          <w:sz w:val="14"/>
-          <w:szCs w:val="14"/>
-        </w:rPr>
-        <w:t>_place</w:t>
-      </w:r>
-      <w:proofErr w:type="spellEnd"/>
-      <w:r>
-        <w:rPr>
-          <w:b/>
-          <w:bCs/>
-          <w:color w:val="000000"/>
-          <w:sz w:val="14"/>
-          <w:szCs w:val="14"/>
-        </w:rPr>
-        <w:t xml:space="preserve"> }}, {{ </w:t>
-      </w:r>
-      <w:proofErr w:type="spellStart"/>
-      <w:r>
-        <w:rPr>
-          <w:b/>
-          <w:bCs/>
-          <w:color w:val="000000"/>
-          <w:sz w:val="14"/>
-          <w:szCs w:val="14"/>
-        </w:rPr>
-        <w:t>work_name</w:t>
-      </w:r>
-      <w:proofErr w:type="spellEnd"/>
-      <w:r>
-        <w:rPr>
-          <w:b/>
-          <w:bCs/>
-          <w:color w:val="000000"/>
-          <w:sz w:val="14"/>
-          <w:szCs w:val="14"/>
-        </w:rPr>
-        <w:t xml:space="preserve"> }}, {{ </w:t>
-      </w:r>
-      <w:proofErr w:type="spellStart"/>
-      <w:r>
-        <w:rPr>
-          <w:b/>
-          <w:bCs/>
-          <w:color w:val="000000"/>
-          <w:sz w:val="14"/>
-          <w:szCs w:val="14"/>
-        </w:rPr>
-        <w:t>work_content</w:t>
-      </w:r>
-      <w:proofErr w:type="spellEnd"/>
-      <w:r>
-        <w:rPr>
-          <w:b/>
-          <w:bCs/>
-          <w:color w:val="000000"/>
-          <w:sz w:val="14"/>
-          <w:szCs w:val="14"/>
-        </w:rPr>
-        <w:t xml:space="preserve"> }}</w:t>
-      </w:r>
-    </w:p>
-    <w:p>
-      <w:pPr>
-        <w:ind w:left="708" w:firstLine="708"/>
-        <w:rPr>
-          <w:sz w:val="12"/>
-          <w:szCs w:val="12"/>
-          <w:vertAlign w:val="superscript"/>
-        </w:rPr>
-      </w:pPr>
-      <w:r>
-        <w:rPr>
-          <w:sz w:val="12"/>
-          <w:szCs w:val="12"/>
-          <w:vertAlign w:val="superscript"/>
-        </w:rPr>
-        <w:t>(</w:t>
-      </w:r>
-      <w:r>
-        <w:rPr>
-          <w:rStyle w:val="s0"/>
-          <w:color w:val="auto"/>
-          <w:sz w:val="12"/>
-          <w:szCs w:val="12"/>
-          <w:vertAlign w:val="superscript"/>
-        </w:rPr>
-        <w:t>Место работы, наименование оборудования, краткое содержание объема работ)</w:t>
-      </w:r>
-    </w:p>
-    <w:p>
-      <w:pPr>
-        <w:rPr>
-          <w:sz w:val="14"/>
-          <w:szCs w:val="14"/>
-          <w:lang w:val="en-US"/>
-        </w:rPr>
-      </w:pPr>
-      <w:r>
-        <w:rPr>
-          <w:sz w:val="14"/>
-          <w:szCs w:val="14"/>
-          <w:lang w:val="en-US"/>
-        </w:rPr>
-        <w:t xml:space="preserve">3. </w:t>
-      </w:r>
-      <w:r>
-        <w:rPr>
-          <w:rStyle w:val="s0"/>
-          <w:sz w:val="14"/>
-          <w:szCs w:val="14"/>
-        </w:rPr>
-        <w:t>Допускающий</w:t>
-      </w:r>
-      <w:r>
-        <w:rPr>
-          <w:rStyle w:val="s0"/>
-          <w:sz w:val="14"/>
-          <w:szCs w:val="14"/>
-          <w:lang w:val="en-US"/>
-        </w:rPr>
-        <w:t>(</w:t>
-      </w:r>
-      <w:r>
-        <w:rPr>
-          <w:rStyle w:val="s0"/>
-          <w:sz w:val="14"/>
-          <w:szCs w:val="14"/>
-        </w:rPr>
-        <w:t>ие</w:t>
-      </w:r>
-      <w:r>
-        <w:rPr>
-          <w:rStyle w:val="s0"/>
-          <w:sz w:val="14"/>
-          <w:szCs w:val="14"/>
-          <w:lang w:val="en-US"/>
-        </w:rPr>
-        <w:t xml:space="preserve">) </w:t>
-      </w:r>
-      <w:r>
-        <w:rPr>
-          <w:rStyle w:val="s0"/>
-          <w:sz w:val="14"/>
-          <w:szCs w:val="14"/>
-        </w:rPr>
-        <w:t>к</w:t>
-      </w:r>
-      <w:r>
-        <w:rPr>
-          <w:rStyle w:val="s0"/>
-          <w:sz w:val="14"/>
-          <w:szCs w:val="14"/>
-          <w:lang w:val="en-US"/>
-        </w:rPr>
-        <w:t xml:space="preserve"> </w:t>
-      </w:r>
-      <w:r>
-        <w:rPr>
-          <w:rStyle w:val="s0"/>
-          <w:sz w:val="14"/>
-          <w:szCs w:val="14"/>
-        </w:rPr>
-        <w:t>работе</w:t>
-      </w:r>
-      <w:r>
-        <w:rPr>
-          <w:rStyle w:val="s0"/>
-          <w:sz w:val="14"/>
-          <w:szCs w:val="14"/>
-          <w:lang w:val="en-US"/>
-        </w:rPr>
-        <w:t>:</w:t>
-      </w:r>
-      <w:r>
-        <w:rPr>
-          <w:rStyle w:val="s0"/>
-          <w:sz w:val="14"/>
-          <w:szCs w:val="14"/>
-          <w:lang w:val="en-US"/>
-        </w:rPr>
-        <w:t xml:space="preserve"> </w:t>
-      </w:r>
-      <w:r>
-        <w:rPr>
-          <w:rStyle w:val="s0"/>
-          <w:b/>
-          <w:sz w:val="14"/>
-          <w:szCs w:val="14"/>
-          <w:lang w:val="en-US"/>
-        </w:rPr>
-        <w:t>{{</w:t>
-      </w:r>
-      <w:proofErr w:type="spellStart"/>
-      <w:r>
-        <w:rPr>
-          <w:rStyle w:val="s0"/>
-          <w:b/>
-          <w:sz w:val="14"/>
-          <w:szCs w:val="14"/>
-          <w:lang w:val="en-US"/>
-        </w:rPr>
-        <w:t>admitting_name</w:t>
-      </w:r>
-      <w:proofErr w:type="spellEnd"/>
-      <w:r>
-        <w:rPr>
-          <w:rStyle w:val="s0"/>
-          <w:b/>
-          <w:sz w:val="14"/>
-          <w:szCs w:val="14"/>
-          <w:lang w:val="en-US"/>
-        </w:rPr>
-        <w:t>}},</w:t>
-      </w:r>
-      <w:r>
-        <w:rPr>
-          <w:rStyle w:val="s0"/>
-          <w:sz w:val="14"/>
-          <w:szCs w:val="14"/>
-          <w:lang w:val="en-US"/>
-        </w:rPr>
-        <w:t xml:space="preserve"> </w:t>
-      </w:r>
-      <w:proofErr w:type="gramStart"/>
-      <w:r>
-        <w:rPr>
-          <w:b/>
-          <w:bCs/>
-          <w:sz w:val="14"/>
-          <w:szCs w:val="14"/>
-          <w:lang w:val="en-US"/>
-        </w:rPr>
-        <w:t xml:space="preserve">{{ </w:t>
-      </w:r>
-      <w:proofErr w:type="spellStart"/>
-      <w:r>
-        <w:rPr>
-          <w:b/>
-          <w:bCs/>
-          <w:sz w:val="14"/>
-          <w:szCs w:val="14"/>
-          <w:lang w:val="en-US"/>
-        </w:rPr>
-        <w:t>admitting</w:t>
-      </w:r>
-      <w:proofErr w:type="gramEnd"/>
-      <w:r>
-        <w:rPr>
-          <w:b/>
-          <w:bCs/>
-          <w:sz w:val="14"/>
-          <w:szCs w:val="14"/>
-          <w:lang w:val="en-US"/>
-        </w:rPr>
-        <w:t>_job</w:t>
-      </w:r>
-      <w:proofErr w:type="spellEnd"/>
-      <w:r>
-        <w:rPr>
-          <w:b/>
-          <w:bCs/>
-          <w:sz w:val="14"/>
-          <w:szCs w:val="14"/>
-          <w:lang w:val="en-US"/>
-        </w:rPr>
-        <w:t>}}, ({{</w:t>
-      </w:r>
-      <w:proofErr w:type="spellStart"/>
-      <w:r>
-        <w:rPr>
-          <w:b/>
-          <w:bCs/>
-          <w:sz w:val="14"/>
-          <w:szCs w:val="14"/>
-          <w:lang w:val="en-US"/>
-        </w:rPr>
-        <w:t>admitting_date</w:t>
-      </w:r>
-      <w:proofErr w:type="spellEnd"/>
-      <w:r>
-        <w:rPr>
-          <w:b/>
-          <w:bCs/>
-          <w:sz w:val="14"/>
-          <w:szCs w:val="14"/>
-          <w:lang w:val="en-US"/>
-        </w:rPr>
-        <w:t>}})</w:t>
-      </w:r>
-    </w:p>
-    <w:p>
-      <w:pPr>
-        <w:ind w:left="708" w:firstLine="708"/>
-        <w:rPr>
-          <w:sz w:val="12"/>
-          <w:szCs w:val="12"/>
-          <w:vertAlign w:val="superscript"/>
-        </w:rPr>
-      </w:pPr>
-      <w:r>
-        <w:rPr>
-          <w:sz w:val="12"/>
-          <w:szCs w:val="12"/>
-          <w:vertAlign w:val="superscript"/>
-        </w:rPr>
-        <w:t>(Ф.И.О. (при его наличии), должность)</w:t>
-      </w:r>
-    </w:p>
-    <w:p>
-      <w:pPr>
-        <w:rPr>
-          <w:b/>
-          <w:bCs/>
-          <w:sz w:val="14"/>
-          <w:szCs w:val="14"/>
-          <w:lang w:val="en-US"/>
-        </w:rPr>
-      </w:pPr>
-      <w:r>
-        <w:rPr>
-          <w:sz w:val="14"/>
-          <w:szCs w:val="14"/>
-          <w:lang w:val="en-US"/>
-        </w:rPr>
-        <w:t xml:space="preserve">4. </w:t>
-      </w:r>
-      <w:r>
-        <w:rPr>
-          <w:sz w:val="14"/>
-          <w:szCs w:val="14"/>
-        </w:rPr>
-        <w:t>Ответственный</w:t>
-      </w:r>
-      <w:r>
-        <w:rPr>
-          <w:sz w:val="14"/>
-          <w:szCs w:val="14"/>
-          <w:lang w:val="en-US"/>
-        </w:rPr>
-        <w:t xml:space="preserve"> </w:t>
-      </w:r>
-      <w:r>
-        <w:rPr>
-          <w:sz w:val="14"/>
-          <w:szCs w:val="14"/>
-        </w:rPr>
-        <w:t>руководитель</w:t>
-      </w:r>
-      <w:r>
-        <w:rPr>
-          <w:sz w:val="14"/>
-          <w:szCs w:val="14"/>
-          <w:lang w:val="en-US"/>
-        </w:rPr>
-        <w:t>:</w:t>
-      </w:r>
-      <w:r>
-        <w:rPr>
-          <w:color w:val="1F4E79"/>
-          <w:sz w:val="14"/>
-          <w:szCs w:val="14"/>
-          <w:lang w:val="en-US"/>
-        </w:rPr>
-        <w:t xml:space="preserve"> </w:t>
-      </w:r>
-      <w:r>
-        <w:rPr>
-          <w:b/>
-          <w:bCs/>
-          <w:sz w:val="14"/>
-          <w:szCs w:val="14"/>
-          <w:lang w:val="en-US"/>
-        </w:rPr>
-        <w:t>{{</w:t>
-      </w:r>
-      <w:proofErr w:type="spellStart"/>
-      <w:r>
-        <w:rPr>
-          <w:b/>
-          <w:bCs/>
-          <w:sz w:val="14"/>
-          <w:szCs w:val="14"/>
-          <w:lang w:val="en-US"/>
-        </w:rPr>
-        <w:t>responsible_name</w:t>
-      </w:r>
-      <w:proofErr w:type="spellEnd"/>
-      <w:r>
-        <w:rPr>
-          <w:b/>
-          <w:bCs/>
-          <w:sz w:val="14"/>
-          <w:szCs w:val="14"/>
-          <w:lang w:val="en-US"/>
-        </w:rPr>
-        <w:t>}}, {{</w:t>
-      </w:r>
-      <w:proofErr w:type="spellStart"/>
-      <w:r>
-        <w:rPr>
-          <w:b/>
-          <w:bCs/>
-          <w:sz w:val="14"/>
-          <w:szCs w:val="14"/>
-          <w:lang w:val="en-US"/>
-        </w:rPr>
-        <w:t>responsible_job</w:t>
-      </w:r>
-      <w:proofErr w:type="spellEnd"/>
-      <w:r>
-        <w:rPr>
-          <w:b/>
-          <w:bCs/>
-          <w:sz w:val="14"/>
-          <w:szCs w:val="14"/>
-          <w:lang w:val="en-US"/>
-        </w:rPr>
-        <w:t>}}, ({{</w:t>
-      </w:r>
-      <w:proofErr w:type="spellStart"/>
-      <w:r>
-        <w:rPr>
-          <w:b/>
-          <w:bCs/>
-          <w:sz w:val="14"/>
-          <w:szCs w:val="14"/>
-          <w:lang w:val="en-US"/>
-        </w:rPr>
-        <w:t>responsible_date</w:t>
-      </w:r>
-      <w:proofErr w:type="spellEnd"/>
-      <w:r>
-        <w:rPr>
-          <w:b/>
-          <w:bCs/>
-          <w:sz w:val="14"/>
-          <w:szCs w:val="14"/>
-          <w:lang w:val="en-US"/>
-        </w:rPr>
-        <w:t>}})</w:t>
-      </w:r>
-    </w:p>
-    <w:p>
-      <w:pPr>
-        <w:ind w:left="708" w:firstLine="708"/>
-        <w:rPr>
-          <w:sz w:val="12"/>
-          <w:szCs w:val="12"/>
-          <w:vertAlign w:val="superscript"/>
-        </w:rPr>
-      </w:pPr>
-      <w:r>
-        <w:rPr>
-          <w:sz w:val="12"/>
-          <w:szCs w:val="12"/>
-          <w:vertAlign w:val="superscript"/>
-        </w:rPr>
-        <w:t>(Ф.И.О. (при его наличии),</w:t>
-      </w:r>
-      <w:r>
-        <w:rPr>
-          <w:sz w:val="12"/>
-          <w:szCs w:val="12"/>
-          <w:vertAlign w:val="superscript"/>
-        </w:rPr>
-        <w:t xml:space="preserve"> должность)</w:t>
-      </w:r>
-    </w:p>
-    <w:p>
-      <w:pPr>
-        <w:rPr>
-          <w:sz w:val="14"/>
-          <w:szCs w:val="14"/>
-        </w:rPr>
-      </w:pPr>
-      <w:r>
-        <w:rPr>
-          <w:sz w:val="14"/>
-          <w:szCs w:val="14"/>
-        </w:rPr>
-        <w:t xml:space="preserve">5. </w:t>
-      </w:r>
-      <w:r>
-        <w:rPr>
-          <w:rStyle w:val="s0"/>
-          <w:sz w:val="14"/>
-          <w:szCs w:val="14"/>
-        </w:rPr>
-        <w:t>Мероприятия для обеспечения безопасности работ</w:t>
-      </w:r>
-      <w:r>
-        <w:rPr>
-          <w:sz w:val="14"/>
-          <w:szCs w:val="14"/>
-        </w:rPr>
-        <w:t>:</w:t>
-      </w:r>
-    </w:p>
-    <w:p>
-      <w:pPr>
-        <w:rPr>
-          <w:color w:val="1F4E79"/>
-          <w:sz w:val="14"/>
-          <w:szCs w:val="14"/>
-        </w:rPr>
-      </w:pPr>
-      <w:r>
-        <w:rPr>
-          <w:sz w:val="14"/>
-          <w:szCs w:val="14"/>
-        </w:rPr>
-        <w:t>5.1. Остановить:</w:t>
-      </w:r>
-      <w:r>
-        <w:rPr>
-          <w:color w:val="1F4E79"/>
-          <w:sz w:val="14"/>
-          <w:szCs w:val="14"/>
-        </w:rPr>
-        <w:t xml:space="preserve"> </w:t>
-      </w:r>
-      <w:proofErr w:type="gramStart"/>
-      <w:r>
-        <w:rPr>
-          <w:b/>
-          <w:bCs/>
-          <w:color w:val="000000"/>
-          <w:sz w:val="14"/>
-          <w:szCs w:val="14"/>
-        </w:rPr>
-        <w:t>{{ m</w:t>
-      </w:r>
-      <w:proofErr w:type="gramEnd"/>
-      <w:r>
-        <w:rPr>
-          <w:b/>
-          <w:bCs/>
-          <w:color w:val="000000"/>
-          <w:sz w:val="14"/>
-          <w:szCs w:val="14"/>
-        </w:rPr>
-        <w:t>5_1 }}</w:t>
+        <w:t>{{ m5_1 }}</w:t>
       </w:r>
     </w:p>
     <w:p>
@@ -1005,7 +678,6 @@
         </w:rPr>
         <w:t xml:space="preserve">5.3. Установить: </w:t>
       </w:r>
-      <w:proofErr w:type="gramStart"/>
       <w:r>
         <w:rPr>
           <w:b/>
@@ -1013,17 +685,7 @@
           <w:sz w:val="14"/>
           <w:szCs w:val="14"/>
         </w:rPr>
-        <w:t>{{ m</w:t>
-      </w:r>
-      <w:proofErr w:type="gramEnd"/>
-      <w:r>
-        <w:rPr>
-          <w:b/>
-          <w:bCs/>
-          <w:sz w:val="14"/>
-          <w:szCs w:val="14"/>
-        </w:rPr>
-        <w:t>5_3 }}</w:t>
+        <w:t>{{ m5_3 }}</w:t>
       </w:r>
     </w:p>
     <w:p>
@@ -1369,7 +1031,6 @@
         </w:rPr>
         <w:t xml:space="preserve">5.10. Дополнительные мероприятия: </w:t>
       </w:r>
-      <w:proofErr w:type="gramStart"/>
       <w:r>
         <w:rPr>
           <w:rStyle w:val="s0"/>
@@ -1378,327 +1039,186 @@
           <w:sz w:val="14"/>
           <w:szCs w:val="14"/>
         </w:rPr>
-        <w:t>{{ m</w:t>
-      </w:r>
-      <w:proofErr w:type="gramEnd"/>
-      <w:r>
-        <w:rPr>
-          <w:rStyle w:val="s0"/>
+        <w:t>{{ m5_10 }}</w:t>
+      </w:r>
+    </w:p>
+    <w:p>
+      <w:pPr>
+        <w:spacing w:line="360" w:lineRule="auto"/>
+        <w:rPr>
+          <w:sz w:val="14"/>
+          <w:szCs w:val="14"/>
+        </w:rPr>
+      </w:pPr>
+    </w:p>
+    <w:p>
+      <w:pPr>
+        <w:spacing w:line="360" w:lineRule="auto"/>
+        <w:rPr>
           <w:b/>
           <w:bCs/>
           <w:sz w:val="14"/>
           <w:szCs w:val="14"/>
         </w:rPr>
-        <w:t>5_10 }}</w:t>
-      </w:r>
-    </w:p>
-    <w:p>
-      <w:pPr>
-        <w:spacing w:line="360" w:lineRule="auto"/>
-        <w:rPr>
-          <w:sz w:val="14"/>
-          <w:szCs w:val="14"/>
-        </w:rPr>
-      </w:pPr>
-    </w:p>
-    <w:p>
-      <w:pPr>
-        <w:spacing w:line="360" w:lineRule="auto"/>
+      </w:pPr>
+      <w:r>
+        <w:rPr>
+          <w:sz w:val="14"/>
+          <w:szCs w:val="14"/>
+        </w:rPr>
+        <w:t>6. Наряд допуск выдал</w:t>
+      </w:r>
+      <w:r>
+        <w:rPr>
+          <w:sz w:val="14"/>
+          <w:szCs w:val="14"/>
+        </w:rPr>
+        <w:t>:</w:t>
+      </w:r>
+      <w:r>
+        <w:rPr>
+          <w:color w:val="1F4E79"/>
+          <w:sz w:val="14"/>
+          <w:szCs w:val="14"/>
+          <w:lang w:val="kk-KZ"/>
+        </w:rPr>
+        <w:t xml:space="preserve"> </w:t>
+      </w:r>
+      <w:r>
         <w:rPr>
           <w:b/>
           <w:bCs/>
           <w:sz w:val="14"/>
           <w:szCs w:val="14"/>
-        </w:rPr>
-      </w:pPr>
-      <w:r>
-        <w:rPr>
-          <w:sz w:val="14"/>
-          <w:szCs w:val="14"/>
-        </w:rPr>
-        <w:t>6. Наряд допуск выдал</w:t>
-      </w:r>
-      <w:r>
-        <w:rPr>
-          <w:sz w:val="14"/>
-          <w:szCs w:val="14"/>
-        </w:rPr>
-        <w:t>:</w:t>
-      </w:r>
-      <w:r>
-        <w:rPr>
-          <w:color w:val="1F4E79"/>
-          <w:sz w:val="14"/>
-          <w:szCs w:val="14"/>
           <w:lang w:val="kk-KZ"/>
         </w:rPr>
+        <w:t>{{ issuer_name }}</w:t>
+      </w:r>
+      <w:r>
+        <w:rPr>
+          <w:b/>
+          <w:bCs/>
+          <w:sz w:val="14"/>
+          <w:szCs w:val="14"/>
+        </w:rPr>
+        <w:t>, {{ issuer_job }}, ({{issuer_date}})</w:t>
+      </w:r>
+    </w:p>
+    <w:p>
+      <w:pPr>
+        <w:ind w:left="708" w:firstLine="708"/>
+        <w:rPr>
+          <w:sz w:val="12"/>
+          <w:szCs w:val="12"/>
+          <w:vertAlign w:val="superscript"/>
+        </w:rPr>
+      </w:pPr>
+      <w:r>
+        <w:rPr>
+          <w:sz w:val="12"/>
+          <w:szCs w:val="12"/>
+          <w:vertAlign w:val="superscript"/>
+        </w:rPr>
+        <w:t>(Ф.И.О. (при его наличии), должность, подпись, дата)</w:t>
+      </w:r>
+    </w:p>
+    <w:p>
+      <w:pPr>
+        <w:rPr>
+          <w:sz w:val="14"/>
+          <w:szCs w:val="14"/>
+          <w:lang w:val="en-US"/>
+        </w:rPr>
+      </w:pPr>
+      <w:r>
+        <w:rPr>
+          <w:sz w:val="14"/>
+          <w:szCs w:val="14"/>
+          <w:lang w:val="en-US"/>
+        </w:rPr>
+        <w:t xml:space="preserve">7. </w:t>
+      </w:r>
+      <w:r>
+        <w:rPr>
+          <w:sz w:val="14"/>
+          <w:szCs w:val="14"/>
+        </w:rPr>
+        <w:t>Мероприятия</w:t>
+      </w:r>
+      <w:r>
+        <w:rPr>
+          <w:sz w:val="14"/>
+          <w:szCs w:val="14"/>
+          <w:lang w:val="en-US"/>
+        </w:rPr>
         <w:t xml:space="preserve"> </w:t>
       </w:r>
-      <w:proofErr w:type="gramStart"/>
+      <w:r>
+        <w:rPr>
+          <w:sz w:val="14"/>
+          <w:szCs w:val="14"/>
+        </w:rPr>
+        <w:t>выполнил</w:t>
+      </w:r>
+      <w:r>
+        <w:rPr>
+          <w:sz w:val="14"/>
+          <w:szCs w:val="14"/>
+          <w:lang w:val="en-US"/>
+        </w:rPr>
+        <w:t xml:space="preserve"> (</w:t>
+      </w:r>
+      <w:r>
+        <w:rPr>
+          <w:sz w:val="14"/>
+          <w:szCs w:val="14"/>
+        </w:rPr>
+        <w:t>и</w:t>
+      </w:r>
+      <w:r>
+        <w:rPr>
+          <w:sz w:val="14"/>
+          <w:szCs w:val="14"/>
+          <w:lang w:val="en-US"/>
+        </w:rPr>
+        <w:t>)</w:t>
+      </w:r>
+      <w:r>
+        <w:rPr>
+          <w:sz w:val="14"/>
+          <w:szCs w:val="14"/>
+          <w:lang w:val="en-US"/>
+        </w:rPr>
+        <w:t xml:space="preserve"> </w:t>
+      </w:r>
+      <w:r>
+        <w:rPr>
+          <w:rStyle w:val="s0"/>
+          <w:b/>
+          <w:sz w:val="14"/>
+          <w:szCs w:val="14"/>
+          <w:lang w:val="en-US"/>
+        </w:rPr>
+        <w:t>{{admitting_name}},</w:t>
+      </w:r>
+      <w:r>
+        <w:rPr>
+          <w:rStyle w:val="s0"/>
+          <w:sz w:val="14"/>
+          <w:szCs w:val="14"/>
+          <w:lang w:val="en-US"/>
+        </w:rPr>
+        <w:t xml:space="preserve"> </w:t>
+      </w:r>
       <w:r>
         <w:rPr>
           <w:b/>
           <w:bCs/>
           <w:sz w:val="14"/>
           <w:szCs w:val="14"/>
-          <w:lang w:val="kk-KZ"/>
-        </w:rPr>
-        <w:t>{{ issuer</w:t>
-      </w:r>
-      <w:proofErr w:type="gramEnd"/>
-      <w:r>
-        <w:rPr>
-          <w:b/>
-          <w:bCs/>
-          <w:sz w:val="14"/>
-          <w:szCs w:val="14"/>
-          <w:lang w:val="kk-KZ"/>
-        </w:rPr>
-        <w:t>_name }}</w:t>
-      </w:r>
-      <w:r>
-        <w:rPr>
-          <w:b/>
-          <w:bCs/>
-          <w:sz w:val="14"/>
-          <w:szCs w:val="14"/>
-        </w:rPr>
-        <w:t xml:space="preserve">, {{ </w:t>
-      </w:r>
-      <w:proofErr w:type="spellStart"/>
-      <w:r>
-        <w:rPr>
-          <w:b/>
-          <w:bCs/>
-          <w:sz w:val="14"/>
-          <w:szCs w:val="14"/>
-        </w:rPr>
-        <w:t>issuer_job</w:t>
-      </w:r>
-      <w:proofErr w:type="spellEnd"/>
-      <w:r>
-        <w:rPr>
-          <w:b/>
-          <w:bCs/>
-          <w:sz w:val="14"/>
-          <w:szCs w:val="14"/>
-        </w:rPr>
-        <w:t xml:space="preserve"> }}, ({{</w:t>
-      </w:r>
-      <w:proofErr w:type="spellStart"/>
-      <w:r>
-        <w:rPr>
-          <w:b/>
-          <w:bCs/>
-          <w:sz w:val="14"/>
-          <w:szCs w:val="14"/>
-        </w:rPr>
-        <w:t>issuer_date</w:t>
-      </w:r>
-      <w:proofErr w:type="spellEnd"/>
-      <w:r>
-        <w:rPr>
-          <w:b/>
-          <w:bCs/>
-          <w:sz w:val="14"/>
-          <w:szCs w:val="14"/>
-        </w:rPr>
-        <w:t>}})</w:t>
-      </w:r>
-    </w:p>
-    <w:p>
-      <w:pPr>
-        <w:ind w:left="708" w:firstLine="708"/>
-        <w:rPr>
-          <w:sz w:val="12"/>
-          <w:szCs w:val="12"/>
-          <w:vertAlign w:val="superscript"/>
-        </w:rPr>
-      </w:pPr>
-      <w:r>
-        <w:rPr>
-          <w:sz w:val="12"/>
-          <w:szCs w:val="12"/>
-          <w:vertAlign w:val="superscript"/>
-        </w:rPr>
-        <w:t>(Ф.И.О. (при его наличии), должность, подпись, дата)</w:t>
-      </w:r>
-    </w:p>
-    <w:p>
-      <w:pPr>
-        <w:rPr>
-          <w:sz w:val="14"/>
-          <w:szCs w:val="14"/>
           <w:lang w:val="en-US"/>
         </w:rPr>
-      </w:pPr>
-      <w:r>
-        <w:rPr>
-          <w:sz w:val="14"/>
-          <w:szCs w:val="14"/>
-          <w:lang w:val="en-US"/>
-        </w:rPr>
-        <w:t xml:space="preserve">7. </w:t>
-      </w:r>
-      <w:r>
-        <w:rPr>
-          <w:sz w:val="14"/>
-          <w:szCs w:val="14"/>
-        </w:rPr>
-        <w:t>Мероприятия</w:t>
-      </w:r>
-      <w:r>
-        <w:rPr>
-          <w:sz w:val="14"/>
-          <w:szCs w:val="14"/>
-          <w:lang w:val="en-US"/>
-        </w:rPr>
-        <w:t xml:space="preserve"> </w:t>
-      </w:r>
-      <w:r>
-        <w:rPr>
-          <w:sz w:val="14"/>
-          <w:szCs w:val="14"/>
-        </w:rPr>
-        <w:t>выполнил</w:t>
-      </w:r>
-      <w:r>
-        <w:rPr>
-          <w:sz w:val="14"/>
-          <w:szCs w:val="14"/>
-          <w:lang w:val="en-US"/>
-        </w:rPr>
-        <w:t xml:space="preserve"> (</w:t>
-      </w:r>
-      <w:r>
-        <w:rPr>
-          <w:sz w:val="14"/>
-          <w:szCs w:val="14"/>
-        </w:rPr>
-        <w:t>и</w:t>
-      </w:r>
-      <w:r>
-        <w:rPr>
-          <w:sz w:val="14"/>
-          <w:szCs w:val="14"/>
-          <w:lang w:val="en-US"/>
-        </w:rPr>
-        <w:t>)</w:t>
-      </w:r>
-      <w:r>
-        <w:rPr>
-          <w:sz w:val="14"/>
-          <w:szCs w:val="14"/>
-          <w:lang w:val="en-US"/>
-        </w:rPr>
-        <w:t xml:space="preserve"> </w:t>
-      </w:r>
-      <w:r>
-        <w:rPr>
-          <w:rStyle w:val="s0"/>
-          <w:b/>
-          <w:sz w:val="14"/>
-          <w:szCs w:val="14"/>
-          <w:lang w:val="en-US"/>
-        </w:rPr>
-        <w:t>{{</w:t>
-      </w:r>
-      <w:proofErr w:type="spellStart"/>
-      <w:r>
-        <w:rPr>
-          <w:rStyle w:val="s0"/>
-          <w:b/>
-          <w:sz w:val="14"/>
-          <w:szCs w:val="14"/>
-          <w:lang w:val="en-US"/>
-        </w:rPr>
-        <w:t>admitting_name</w:t>
-      </w:r>
-      <w:proofErr w:type="spellEnd"/>
-      <w:r>
-        <w:rPr>
-          <w:rStyle w:val="s0"/>
-          <w:b/>
-          <w:sz w:val="14"/>
-          <w:szCs w:val="14"/>
-          <w:lang w:val="en-US"/>
-        </w:rPr>
-        <w:t>}},</w:t>
-      </w:r>
-      <w:r>
-        <w:rPr>
-          <w:rStyle w:val="s0"/>
-          <w:sz w:val="14"/>
-          <w:szCs w:val="14"/>
-          <w:lang w:val="en-US"/>
-        </w:rPr>
-        <w:t xml:space="preserve"> </w:t>
-      </w:r>
-      <w:proofErr w:type="gramStart"/>
-      <w:r>
-        <w:rPr>
-          <w:b/>
-          <w:bCs/>
-          <w:sz w:val="14"/>
-          <w:szCs w:val="14"/>
-          <w:lang w:val="en-US"/>
-        </w:rPr>
-        <w:t xml:space="preserve">{{ </w:t>
-      </w:r>
-      <w:proofErr w:type="spellStart"/>
-      <w:r>
-        <w:rPr>
-          <w:b/>
-          <w:bCs/>
-          <w:sz w:val="14"/>
-          <w:szCs w:val="14"/>
-          <w:lang w:val="en-US"/>
-        </w:rPr>
-        <w:t>admitting</w:t>
-      </w:r>
-      <w:proofErr w:type="gramEnd"/>
-      <w:r>
-        <w:rPr>
-          <w:b/>
-          <w:bCs/>
-          <w:sz w:val="14"/>
-          <w:szCs w:val="14"/>
-          <w:lang w:val="en-US"/>
-        </w:rPr>
-        <w:t>_job</w:t>
-      </w:r>
-      <w:proofErr w:type="spellEnd"/>
-      <w:r>
-        <w:rPr>
-          <w:b/>
-          <w:bCs/>
-          <w:sz w:val="14"/>
-          <w:szCs w:val="14"/>
-          <w:lang w:val="en-US"/>
-        </w:rPr>
-        <w:t>}}, ({{</w:t>
-      </w:r>
-      <w:proofErr w:type="spellStart"/>
-      <w:r>
-        <w:rPr>
-          <w:b/>
-          <w:bCs/>
-          <w:sz w:val="14"/>
-          <w:szCs w:val="14"/>
-          <w:lang w:val="en-US"/>
-        </w:rPr>
-        <w:t>admitting_date</w:t>
-      </w:r>
-      <w:proofErr w:type="spellEnd"/>
-      <w:r>
-        <w:rPr>
-          <w:b/>
-          <w:bCs/>
-          <w:sz w:val="14"/>
-          <w:szCs w:val="14"/>
-          <w:lang w:val="en-US"/>
-        </w:rPr>
-        <w:t>}})</w:t>
+        <w:t>{{ admitting_job}}, ({{admitting_date}})</w:t>
       </w:r>
     </w:p>
     <w:p>
@@ -2041,67 +1561,7 @@
           <w:szCs w:val="14"/>
           <w:lang w:val="en-US"/>
         </w:rPr>
-        <w:t>{{</w:t>
-      </w:r>
-      <w:proofErr w:type="spellStart"/>
-      <w:r>
-        <w:rPr>
-          <w:b/>
-          <w:sz w:val="14"/>
-          <w:szCs w:val="14"/>
-          <w:lang w:val="en-US"/>
-        </w:rPr>
-        <w:t>supervisor_name</w:t>
-      </w:r>
-      <w:proofErr w:type="spellEnd"/>
-      <w:r>
-        <w:rPr>
-          <w:b/>
-          <w:sz w:val="14"/>
-          <w:szCs w:val="14"/>
-          <w:lang w:val="en-US"/>
-        </w:rPr>
-        <w:t>}}, {{</w:t>
-      </w:r>
-      <w:proofErr w:type="spellStart"/>
-      <w:r>
-        <w:rPr>
-          <w:b/>
-          <w:sz w:val="14"/>
-          <w:szCs w:val="14"/>
-          <w:lang w:val="en-US"/>
-        </w:rPr>
-        <w:t>supervisor_job</w:t>
-      </w:r>
-      <w:proofErr w:type="spellEnd"/>
-      <w:r>
-        <w:rPr>
-          <w:b/>
-          <w:sz w:val="14"/>
-          <w:szCs w:val="14"/>
-          <w:lang w:val="en-US"/>
-        </w:rPr>
-        <w:t>}}, ({{</w:t>
-      </w:r>
-      <w:proofErr w:type="spellStart"/>
-      <w:r>
-        <w:rPr>
-          <w:b/>
-          <w:sz w:val="14"/>
-          <w:szCs w:val="14"/>
-          <w:lang w:val="en-US"/>
-        </w:rPr>
-        <w:t>supervisor_date</w:t>
-      </w:r>
-      <w:proofErr w:type="spellEnd"/>
-      <w:r>
-        <w:rPr>
-          <w:b/>
-          <w:sz w:val="14"/>
-          <w:szCs w:val="14"/>
-          <w:lang w:val="en-US"/>
-        </w:rPr>
-        <w:t>}})</w:t>
+        <w:t>{{supervisor_name}}, {{supervisor_job}}, ({{supervisor_date}})</w:t>
       </w:r>
     </w:p>
     <w:p>
@@ -2660,21 +2120,12 @@
                 <w:szCs w:val="20"/>
               </w:rPr>
             </w:pPr>
-            <w:proofErr w:type="spellStart"/>
             <w:r>
               <w:rPr>
                 <w:sz w:val="14"/>
                 <w:szCs w:val="20"/>
               </w:rPr>
-              <w:t>п.п</w:t>
-            </w:r>
-            <w:proofErr w:type="spellEnd"/>
-            <w:r>
-              <w:rPr>
-                <w:sz w:val="14"/>
-                <w:szCs w:val="20"/>
-              </w:rPr>
-              <w:t>.</w:t>
+              <w:t>п.п.</w:t>
             </w:r>
           </w:p>
         </w:tc>
@@ -2849,32 +2300,14 @@
                 <w:szCs w:val="20"/>
                 <w:lang w:val="en-US"/>
               </w:rPr>
-              <w:t xml:space="preserve">{%tr for p in </w:t>
-            </w:r>
-            <w:proofErr w:type="spellStart"/>
-            <w:r>
-              <w:rPr>
-                <w:sz w:val="20"/>
-                <w:szCs w:val="20"/>
-                <w:lang w:val="en-US"/>
-              </w:rPr>
-              <w:t>brigade_list</w:t>
-            </w:r>
-            <w:proofErr w:type="spellEnd"/>
-            <w:r>
-              <w:rPr>
-                <w:sz w:val="20"/>
-                <w:szCs w:val="20"/>
-                <w:lang w:val="en-US"/>
-              </w:rPr>
-              <w:t xml:space="preserve"> %}</w:t>
+              <w:t>{%tr for p in brigade_list %}</w:t>
             </w:r>
           </w:p>
         </w:tc>
       </w:tr>
       <w:tr>
         <w:trPr>
-          <w:trHeight w:val="131"/>
+          <w:trHeight w:val="917"/>
         </w:trPr>
         <w:tc>
           <w:tcPr>
@@ -2902,25 +2335,7 @@
                 <w:szCs w:val="20"/>
                 <w:lang w:val="en-US"/>
               </w:rPr>
-              <w:t>{{</w:t>
-            </w:r>
-            <w:proofErr w:type="spellStart"/>
-            <w:r>
-              <w:rPr>
-                <w:color w:val="000000" w:themeColor="text1"/>
-                <w:szCs w:val="20"/>
-                <w:lang w:val="en-US"/>
-              </w:rPr>
-              <w:t>p.i</w:t>
-            </w:r>
-            <w:proofErr w:type="spellEnd"/>
-            <w:r>
-              <w:rPr>
-                <w:color w:val="000000" w:themeColor="text1"/>
-                <w:szCs w:val="20"/>
-                <w:lang w:val="en-US"/>
-              </w:rPr>
-              <w:t>}}</w:t>
+              <w:t>{{p.i}}</w:t>
             </w:r>
           </w:p>
         </w:tc>
@@ -2950,25 +2365,7 @@
                 <w:szCs w:val="20"/>
                 <w:lang w:val="en-US"/>
               </w:rPr>
-              <w:t>{{</w:t>
-            </w:r>
-            <w:proofErr w:type="spellStart"/>
-            <w:r>
-              <w:rPr>
-                <w:color w:val="000000" w:themeColor="text1"/>
-                <w:szCs w:val="20"/>
-                <w:lang w:val="en-US"/>
-              </w:rPr>
-              <w:t>p.date</w:t>
-            </w:r>
-            <w:proofErr w:type="spellEnd"/>
-            <w:r>
-              <w:rPr>
-                <w:color w:val="000000" w:themeColor="text1"/>
-                <w:szCs w:val="20"/>
-                <w:lang w:val="en-US"/>
-              </w:rPr>
-              <w:t>}}</w:t>
+              <w:t>{{p.date}}</w:t>
             </w:r>
           </w:p>
         </w:tc>
@@ -2998,17 +2395,7 @@
                 <w:szCs w:val="20"/>
                 <w:lang w:val="en-US"/>
               </w:rPr>
-              <w:t>{{p</w:t>
-            </w:r>
-            <w:bookmarkStart w:id="0" w:name="_GoBack"/>
-            <w:bookmarkEnd w:id="0"/>
-            <w:r>
-              <w:rPr>
-                <w:color w:val="000000" w:themeColor="text1"/>
-                <w:szCs w:val="20"/>
-                <w:lang w:val="en-US"/>
-              </w:rPr>
-              <w:t>.name}}</w:t>
+              <w:t>{{p.name}}</w:t>
             </w:r>
           </w:p>
         </w:tc>
@@ -3038,25 +2425,7 @@
                 <w:szCs w:val="20"/>
                 <w:lang w:val="en-US"/>
               </w:rPr>
-              <w:t>{{</w:t>
-            </w:r>
-            <w:proofErr w:type="spellStart"/>
-            <w:r>
-              <w:rPr>
-                <w:color w:val="000000" w:themeColor="text1"/>
-                <w:szCs w:val="20"/>
-                <w:lang w:val="en-US"/>
-              </w:rPr>
-              <w:t>p.job</w:t>
-            </w:r>
-            <w:proofErr w:type="spellEnd"/>
-            <w:r>
-              <w:rPr>
-                <w:color w:val="000000" w:themeColor="text1"/>
-                <w:szCs w:val="20"/>
-                <w:lang w:val="en-US"/>
-              </w:rPr>
-              <w:t>}}</w:t>
+              <w:t>{{p.job}}</w:t>
             </w:r>
           </w:p>
         </w:tc>
@@ -3086,25 +2455,7 @@
                 <w:szCs w:val="20"/>
                 <w:lang w:val="en-US"/>
               </w:rPr>
-              <w:t xml:space="preserve">{{ </w:t>
-            </w:r>
-            <w:proofErr w:type="spellStart"/>
-            <w:r>
-              <w:rPr>
-                <w:color w:val="000000" w:themeColor="text1"/>
-                <w:szCs w:val="20"/>
-                <w:lang w:val="en-US"/>
-              </w:rPr>
-              <w:t>p.signature_img</w:t>
-            </w:r>
-            <w:proofErr w:type="spellEnd"/>
-            <w:r>
-              <w:rPr>
-                <w:color w:val="000000" w:themeColor="text1"/>
-                <w:szCs w:val="20"/>
-                <w:lang w:val="en-US"/>
-              </w:rPr>
-              <w:t xml:space="preserve"> }}</w:t>
+              <w:t>{{ p.signature_img }}</w:t>
             </w:r>
           </w:p>
         </w:tc>
@@ -3134,25 +2485,7 @@
                 <w:szCs w:val="20"/>
                 <w:lang w:val="en-US"/>
               </w:rPr>
-              <w:t>{{</w:t>
-            </w:r>
-            <w:proofErr w:type="spellStart"/>
-            <w:r>
-              <w:rPr>
-                <w:color w:val="000000" w:themeColor="text1"/>
-                <w:szCs w:val="20"/>
-                <w:lang w:val="en-US"/>
-              </w:rPr>
-              <w:t>p.instr_by</w:t>
-            </w:r>
-            <w:proofErr w:type="spellEnd"/>
-            <w:r>
-              <w:rPr>
-                <w:color w:val="000000" w:themeColor="text1"/>
-                <w:szCs w:val="20"/>
-                <w:lang w:val="en-US"/>
-              </w:rPr>
-              <w:t>}}</w:t>
+              <w:t>{{p.instr_by}}</w:t>
             </w:r>
           </w:p>
         </w:tc>
@@ -3182,35 +2515,7 @@
               <w:rPr>
                 <w:szCs w:val="20"/>
               </w:rPr>
-              <w:t>{%</w:t>
-            </w:r>
-            <w:proofErr w:type="spellStart"/>
-            <w:r>
-              <w:rPr>
-                <w:szCs w:val="20"/>
-              </w:rPr>
-              <w:t>tr</w:t>
-            </w:r>
-            <w:proofErr w:type="spellEnd"/>
-            <w:r>
-              <w:rPr>
-                <w:szCs w:val="20"/>
-              </w:rPr>
-              <w:t xml:space="preserve"> </w:t>
-            </w:r>
-            <w:proofErr w:type="spellStart"/>
-            <w:r>
-              <w:rPr>
-                <w:szCs w:val="20"/>
-              </w:rPr>
-              <w:t>endfor</w:t>
-            </w:r>
-            <w:proofErr w:type="spellEnd"/>
-            <w:r>
-              <w:rPr>
-                <w:szCs w:val="20"/>
-              </w:rPr>
-              <w:t xml:space="preserve"> %}</w:t>
+              <w:t>{%tr endfor %}</w:t>
             </w:r>
           </w:p>
         </w:tc>
@@ -3247,25 +2552,7 @@
           <w:szCs w:val="14"/>
           <w:u w:val="single"/>
         </w:rPr>
-        <w:t xml:space="preserve">{{ </w:t>
-      </w:r>
-      <w:proofErr w:type="spellStart"/>
-      <w:r>
-        <w:rPr>
-          <w:sz w:val="14"/>
-          <w:szCs w:val="14"/>
-          <w:u w:val="single"/>
-        </w:rPr>
-        <w:t>team_count</w:t>
-      </w:r>
-      <w:proofErr w:type="spellEnd"/>
-      <w:r>
-        <w:rPr>
-          <w:sz w:val="14"/>
-          <w:szCs w:val="14"/>
-          <w:u w:val="single"/>
-        </w:rPr>
-        <w:t xml:space="preserve"> }}</w:t>
+        <w:t>{{ team_count }}</w:t>
       </w:r>
       <w:r>
         <w:rPr>
@@ -3630,25 +2917,7 @@
                 <w:szCs w:val="6"/>
                 <w:lang w:val="en-US"/>
               </w:rPr>
-              <w:t xml:space="preserve">{%tr for e in </w:t>
-            </w:r>
-            <w:proofErr w:type="spellStart"/>
-            <w:r>
-              <w:rPr>
-                <w:sz w:val="6"/>
-                <w:szCs w:val="6"/>
-                <w:lang w:val="en-US"/>
-              </w:rPr>
-              <w:t>extension_list</w:t>
-            </w:r>
-            <w:proofErr w:type="spellEnd"/>
-            <w:r>
-              <w:rPr>
-                <w:sz w:val="6"/>
-                <w:szCs w:val="6"/>
-                <w:lang w:val="en-US"/>
-              </w:rPr>
-              <w:t xml:space="preserve"> %}</w:t>
+              <w:t>{%tr for e in extension_list %}</w:t>
             </w:r>
           </w:p>
         </w:tc>
@@ -3679,25 +2948,7 @@
                 <w:szCs w:val="12"/>
                 <w:lang w:val="en-US"/>
               </w:rPr>
-              <w:t>{{</w:t>
-            </w:r>
-            <w:proofErr w:type="spellStart"/>
-            <w:r>
-              <w:rPr>
-                <w:sz w:val="12"/>
-                <w:szCs w:val="12"/>
-                <w:lang w:val="en-US"/>
-              </w:rPr>
-              <w:t>e.date</w:t>
-            </w:r>
-            <w:proofErr w:type="spellEnd"/>
-            <w:r>
-              <w:rPr>
-                <w:sz w:val="12"/>
-                <w:szCs w:val="12"/>
-                <w:lang w:val="en-US"/>
-              </w:rPr>
-              <w:t>}}</w:t>
+              <w:t>{{e.date}}</w:t>
             </w:r>
           </w:p>
         </w:tc>
@@ -3724,23 +2975,7 @@
                 <w:sz w:val="12"/>
                 <w:szCs w:val="12"/>
               </w:rPr>
-              <w:t>{{</w:t>
-            </w:r>
-            <w:proofErr w:type="spellStart"/>
-            <w:r>
-              <w:rPr>
-                <w:sz w:val="12"/>
-                <w:szCs w:val="12"/>
-              </w:rPr>
-              <w:t>e.prod_out</w:t>
-            </w:r>
-            <w:proofErr w:type="spellEnd"/>
-            <w:r>
-              <w:rPr>
-                <w:sz w:val="12"/>
-                <w:szCs w:val="12"/>
-              </w:rPr>
-              <w:t>}}</w:t>
+              <w:t>{{e.prod_out}}</w:t>
             </w:r>
           </w:p>
         </w:tc>
@@ -3795,23 +3030,7 @@
                 <w:sz w:val="12"/>
                 <w:szCs w:val="12"/>
               </w:rPr>
-              <w:t>{{</w:t>
-            </w:r>
-            <w:proofErr w:type="spellStart"/>
-            <w:r>
-              <w:rPr>
-                <w:sz w:val="12"/>
-                <w:szCs w:val="12"/>
-              </w:rPr>
-              <w:t>e.count</w:t>
-            </w:r>
-            <w:proofErr w:type="spellEnd"/>
-            <w:r>
-              <w:rPr>
-                <w:sz w:val="12"/>
-                <w:szCs w:val="12"/>
-              </w:rPr>
-              <w:t>}}</w:t>
+              <w:t>{{e.count}}</w:t>
             </w:r>
           </w:p>
         </w:tc>
@@ -3838,23 +3057,7 @@
                 <w:sz w:val="12"/>
                 <w:szCs w:val="12"/>
               </w:rPr>
-              <w:t>{{</w:t>
-            </w:r>
-            <w:proofErr w:type="spellStart"/>
-            <w:r>
-              <w:rPr>
-                <w:sz w:val="12"/>
-                <w:szCs w:val="12"/>
-              </w:rPr>
-              <w:t>e.prod_in</w:t>
-            </w:r>
-            <w:proofErr w:type="spellEnd"/>
-            <w:r>
-              <w:rPr>
-                <w:sz w:val="12"/>
-                <w:szCs w:val="12"/>
-              </w:rPr>
-              <w:t>}}</w:t>
+              <w:t>{{e.prod_in}}</w:t>
             </w:r>
           </w:p>
         </w:tc>
@@ -3908,23 +3111,7 @@
                 <w:sz w:val="12"/>
                 <w:szCs w:val="12"/>
               </w:rPr>
-              <w:t>{{</w:t>
-            </w:r>
-            <w:proofErr w:type="spellStart"/>
-            <w:r>
-              <w:rPr>
-                <w:sz w:val="12"/>
-                <w:szCs w:val="12"/>
-              </w:rPr>
-              <w:t>e.admin</w:t>
-            </w:r>
-            <w:proofErr w:type="spellEnd"/>
-            <w:r>
-              <w:rPr>
-                <w:sz w:val="12"/>
-                <w:szCs w:val="12"/>
-              </w:rPr>
-              <w:t>}}</w:t>
+              <w:t>{{e.admin}}</w:t>
             </w:r>
           </w:p>
         </w:tc>
@@ -3980,39 +3167,7 @@
                 <w:sz w:val="6"/>
                 <w:szCs w:val="6"/>
               </w:rPr>
-              <w:t>{%</w:t>
-            </w:r>
-            <w:proofErr w:type="spellStart"/>
-            <w:r>
-              <w:rPr>
-                <w:sz w:val="6"/>
-                <w:szCs w:val="6"/>
-              </w:rPr>
-              <w:t>tr</w:t>
-            </w:r>
-            <w:proofErr w:type="spellEnd"/>
-            <w:r>
-              <w:rPr>
-                <w:sz w:val="6"/>
-                <w:szCs w:val="6"/>
-              </w:rPr>
-              <w:t xml:space="preserve"> </w:t>
-            </w:r>
-            <w:proofErr w:type="spellStart"/>
-            <w:r>
-              <w:rPr>
-                <w:sz w:val="6"/>
-                <w:szCs w:val="6"/>
-              </w:rPr>
-              <w:t>endfor</w:t>
-            </w:r>
-            <w:proofErr w:type="spellEnd"/>
-            <w:r>
-              <w:rPr>
-                <w:sz w:val="6"/>
-                <w:szCs w:val="6"/>
-              </w:rPr>
-              <w:t xml:space="preserve"> %}</w:t>
+              <w:t>{%tr endfor %}</w:t>
             </w:r>
           </w:p>
         </w:tc>
@@ -4048,15 +3203,7 @@
           <w:sz w:val="14"/>
           <w:szCs w:val="14"/>
         </w:rPr>
-        <w:t>_________________</w:t>
-      </w:r>
-      <w:r>
-        <w:rPr>
-          <w:color w:val="000000" w:themeColor="text1"/>
-          <w:sz w:val="14"/>
-          <w:szCs w:val="14"/>
-        </w:rPr>
-        <w:t>________________________</w:t>
+        <w:t>{{ date_end }}</w:t>
       </w:r>
       <w:r>
         <w:rPr>
@@ -4091,12 +3238,20 @@
     <w:p>
       <w:pPr>
         <w:pStyle w:val="pj"/>
-        <w:ind w:left="2124" w:firstLine="708"/>
-        <w:rPr>
-          <w:sz w:val="14"/>
-          <w:szCs w:val="14"/>
-        </w:rPr>
-      </w:pPr>
+        <w:rPr>
+          <w:sz w:val="14"/>
+          <w:szCs w:val="14"/>
+        </w:rPr>
+      </w:pPr>
+      <w:r>
+        <w:rPr>
+          <w:color w:val="auto"/>
+          <w:sz w:val="14"/>
+          <w:szCs w:val="14"/>
+          <w:vertAlign w:val="superscript"/>
+        </w:rPr>
+        <w:t xml:space="preserve">                                                            </w:t>
+      </w:r>
       <w:r>
         <w:rPr>
           <w:color w:val="auto"/>
@@ -4347,21 +3502,12 @@
         <w:szCs w:val="16"/>
       </w:rPr>
     </w:pPr>
-    <w:proofErr w:type="gramStart"/>
     <w:r>
       <w:rPr>
         <w:sz w:val="16"/>
         <w:szCs w:val="16"/>
       </w:rPr>
-      <w:t>{{ qr</w:t>
-    </w:r>
-    <w:proofErr w:type="gramEnd"/>
-    <w:r>
-      <w:rPr>
-        <w:sz w:val="16"/>
-        <w:szCs w:val="16"/>
-      </w:rPr>
-      <w:t>_code }}</w:t>
+      <w:t>{{ qr_code }}</w:t>
     </w:r>
   </w:p>
 </w:ftr>
@@ -4373,13 +3519,8 @@
     <w:pPr>
       <w:pStyle w:val="a8"/>
     </w:pPr>
-    <w:proofErr w:type="gramStart"/>
     <w:r>
-      <w:t>{{ qr</w:t>
-    </w:r>
-    <w:proofErr w:type="gramEnd"/>
-    <w:r>
-      <w:t>_code }}</w:t>
+      <w:t>{{ qr_code }}</w:t>
     </w:r>
   </w:p>
 </w:ftr>
@@ -5320,7 +4461,7 @@
 </file>
 
 <file path=customXml/itemProps1.xml><?xml version="1.0" encoding="utf-8"?>
-<ds:datastoreItem xmlns:ds="http://schemas.openxmlformats.org/officeDocument/2006/customXml" ds:itemID="{89658E5F-2359-4AC1-A790-1737128CA2C2}">
+<ds:datastoreItem xmlns:ds="http://schemas.openxmlformats.org/officeDocument/2006/customXml" ds:itemID="{CFAA3DEE-439E-47B2-B5FF-4A0B39408DCB}">
   <ds:schemaRefs>
     <ds:schemaRef ds:uri="http://schemas.openxmlformats.org/officeDocument/2006/bibliography"/>
   </ds:schemaRefs>

</xml_diff>

<commit_message>
Draft autosave to DB, signature pad fix, DOCX brigade signature 25x9mm, risk table appendix
Made-with: Cursor
</commit_message>
<xml_diff>
--- a/templates/docx/dangerous_permits_rus.docx
+++ b/templates/docx/dangerous_permits_rus.docx
@@ -11,6 +11,8 @@
           <w:szCs w:val="16"/>
         </w:rPr>
       </w:pPr>
+      <w:bookmarkStart w:id="0" w:name="_GoBack"/>
+      <w:bookmarkEnd w:id="0"/>
       <w:r>
         <w:rPr>
           <w:rStyle w:val="s0"/>
@@ -2329,8 +2331,6 @@
           <w:szCs w:val="14"/>
         </w:rPr>
       </w:pPr>
-      <w:bookmarkStart w:id="0" w:name="_GoBack"/>
-      <w:bookmarkEnd w:id="0"/>
       <w:r>
         <w:rPr>
           <w:sz w:val="14"/>
@@ -2841,7 +2841,7 @@
             </w:pPr>
             <w:r>
               <w:rPr>
-                <w:sz w:val="20"/>
+                <w:sz w:val="16"/>
                 <w:szCs w:val="20"/>
                 <w:lang w:val="en-US"/>
               </w:rPr>
@@ -2850,7 +2850,7 @@
             <w:proofErr w:type="spellStart"/>
             <w:r>
               <w:rPr>
-                <w:sz w:val="20"/>
+                <w:sz w:val="16"/>
                 <w:szCs w:val="20"/>
                 <w:lang w:val="en-US"/>
               </w:rPr>
@@ -2859,7 +2859,7 @@
             <w:proofErr w:type="spellEnd"/>
             <w:r>
               <w:rPr>
-                <w:sz w:val="20"/>
+                <w:sz w:val="16"/>
                 <w:szCs w:val="20"/>
                 <w:lang w:val="en-US"/>
               </w:rPr>
@@ -2868,7 +2868,7 @@
             <w:proofErr w:type="spellStart"/>
             <w:r>
               <w:rPr>
-                <w:sz w:val="20"/>
+                <w:sz w:val="16"/>
                 <w:szCs w:val="20"/>
                 <w:lang w:val="en-US"/>
               </w:rPr>
@@ -2877,7 +2877,7 @@
             <w:proofErr w:type="spellEnd"/>
             <w:r>
               <w:rPr>
-                <w:sz w:val="20"/>
+                <w:sz w:val="16"/>
                 <w:szCs w:val="20"/>
                 <w:lang w:val="en-US"/>
               </w:rPr>
@@ -2888,7 +2888,7 @@
       </w:tr>
       <w:tr>
         <w:trPr>
-          <w:trHeight w:val="917"/>
+          <w:trHeight w:val="456"/>
         </w:trPr>
         <w:tc>
           <w:tcPr>
@@ -2906,6 +2906,7 @@
               <w:jc w:val="center"/>
               <w:rPr>
                 <w:color w:val="000000" w:themeColor="text1"/>
+                <w:sz w:val="16"/>
                 <w:szCs w:val="20"/>
                 <w:lang w:val="en-US"/>
               </w:rPr>
@@ -2913,6 +2914,7 @@
             <w:r>
               <w:rPr>
                 <w:color w:val="000000" w:themeColor="text1"/>
+                <w:sz w:val="16"/>
                 <w:szCs w:val="20"/>
                 <w:lang w:val="en-US"/>
               </w:rPr>
@@ -2922,6 +2924,7 @@
             <w:r>
               <w:rPr>
                 <w:color w:val="000000" w:themeColor="text1"/>
+                <w:sz w:val="16"/>
                 <w:szCs w:val="20"/>
                 <w:lang w:val="en-US"/>
               </w:rPr>
@@ -2931,6 +2934,7 @@
             <w:r>
               <w:rPr>
                 <w:color w:val="000000" w:themeColor="text1"/>
+                <w:sz w:val="16"/>
                 <w:szCs w:val="20"/>
                 <w:lang w:val="en-US"/>
               </w:rPr>
@@ -2954,6 +2958,7 @@
               <w:jc w:val="center"/>
               <w:rPr>
                 <w:color w:val="000000" w:themeColor="text1"/>
+                <w:sz w:val="16"/>
                 <w:szCs w:val="20"/>
                 <w:lang w:val="en-US"/>
               </w:rPr>
@@ -2961,6 +2966,7 @@
             <w:r>
               <w:rPr>
                 <w:color w:val="000000" w:themeColor="text1"/>
+                <w:sz w:val="16"/>
                 <w:szCs w:val="20"/>
                 <w:lang w:val="en-US"/>
               </w:rPr>
@@ -2970,6 +2976,7 @@
             <w:r>
               <w:rPr>
                 <w:color w:val="000000" w:themeColor="text1"/>
+                <w:sz w:val="16"/>
                 <w:szCs w:val="20"/>
                 <w:lang w:val="en-US"/>
               </w:rPr>
@@ -2979,6 +2986,7 @@
             <w:r>
               <w:rPr>
                 <w:color w:val="000000" w:themeColor="text1"/>
+                <w:sz w:val="16"/>
                 <w:szCs w:val="20"/>
                 <w:lang w:val="en-US"/>
               </w:rPr>
@@ -3002,6 +3010,7 @@
               <w:jc w:val="center"/>
               <w:rPr>
                 <w:color w:val="000000" w:themeColor="text1"/>
+                <w:sz w:val="16"/>
                 <w:szCs w:val="20"/>
                 <w:lang w:val="en-US"/>
               </w:rPr>
@@ -3009,6 +3018,7 @@
             <w:r>
               <w:rPr>
                 <w:color w:val="000000" w:themeColor="text1"/>
+                <w:sz w:val="16"/>
                 <w:szCs w:val="20"/>
                 <w:lang w:val="en-US"/>
               </w:rPr>
@@ -3032,6 +3042,7 @@
               <w:jc w:val="center"/>
               <w:rPr>
                 <w:color w:val="000000" w:themeColor="text1"/>
+                <w:sz w:val="16"/>
                 <w:szCs w:val="20"/>
                 <w:lang w:val="en-US"/>
               </w:rPr>
@@ -3039,6 +3050,7 @@
             <w:r>
               <w:rPr>
                 <w:color w:val="000000" w:themeColor="text1"/>
+                <w:sz w:val="16"/>
                 <w:szCs w:val="20"/>
                 <w:lang w:val="en-US"/>
               </w:rPr>
@@ -3048,6 +3060,7 @@
             <w:r>
               <w:rPr>
                 <w:color w:val="000000" w:themeColor="text1"/>
+                <w:sz w:val="16"/>
                 <w:szCs w:val="20"/>
                 <w:lang w:val="en-US"/>
               </w:rPr>
@@ -3057,6 +3070,7 @@
             <w:r>
               <w:rPr>
                 <w:color w:val="000000" w:themeColor="text1"/>
+                <w:sz w:val="16"/>
                 <w:szCs w:val="20"/>
                 <w:lang w:val="en-US"/>
               </w:rPr>
@@ -3080,6 +3094,7 @@
               <w:jc w:val="center"/>
               <w:rPr>
                 <w:color w:val="000000" w:themeColor="text1"/>
+                <w:sz w:val="16"/>
                 <w:szCs w:val="20"/>
                 <w:lang w:val="en-US"/>
               </w:rPr>
@@ -3087,6 +3102,7 @@
             <w:r>
               <w:rPr>
                 <w:color w:val="000000" w:themeColor="text1"/>
+                <w:sz w:val="16"/>
                 <w:szCs w:val="20"/>
                 <w:lang w:val="en-US"/>
               </w:rPr>
@@ -3096,6 +3112,7 @@
             <w:r>
               <w:rPr>
                 <w:color w:val="000000" w:themeColor="text1"/>
+                <w:sz w:val="16"/>
                 <w:szCs w:val="20"/>
                 <w:lang w:val="en-US"/>
               </w:rPr>
@@ -3105,6 +3122,7 @@
             <w:r>
               <w:rPr>
                 <w:color w:val="000000" w:themeColor="text1"/>
+                <w:sz w:val="16"/>
                 <w:szCs w:val="20"/>
                 <w:lang w:val="en-US"/>
               </w:rPr>
@@ -3128,6 +3146,7 @@
               <w:jc w:val="center"/>
               <w:rPr>
                 <w:color w:val="000000" w:themeColor="text1"/>
+                <w:sz w:val="16"/>
                 <w:szCs w:val="20"/>
                 <w:lang w:val="en-US"/>
               </w:rPr>
@@ -3135,6 +3154,7 @@
             <w:r>
               <w:rPr>
                 <w:color w:val="000000" w:themeColor="text1"/>
+                <w:sz w:val="16"/>
                 <w:szCs w:val="20"/>
                 <w:lang w:val="en-US"/>
               </w:rPr>
@@ -3144,6 +3164,7 @@
             <w:r>
               <w:rPr>
                 <w:color w:val="000000" w:themeColor="text1"/>
+                <w:sz w:val="16"/>
                 <w:szCs w:val="20"/>
                 <w:lang w:val="en-US"/>
               </w:rPr>
@@ -3153,6 +3174,7 @@
             <w:r>
               <w:rPr>
                 <w:color w:val="000000" w:themeColor="text1"/>
+                <w:sz w:val="16"/>
                 <w:szCs w:val="20"/>
                 <w:lang w:val="en-US"/>
               </w:rPr>
@@ -3184,6 +3206,7 @@
             </w:pPr>
             <w:r>
               <w:rPr>
+                <w:sz w:val="16"/>
                 <w:szCs w:val="20"/>
               </w:rPr>
               <w:t>{%</w:t>
@@ -3191,6 +3214,7 @@
             <w:proofErr w:type="spellStart"/>
             <w:r>
               <w:rPr>
+                <w:sz w:val="16"/>
                 <w:szCs w:val="20"/>
               </w:rPr>
               <w:t>tr</w:t>
@@ -3198,6 +3222,7 @@
             <w:proofErr w:type="spellEnd"/>
             <w:r>
               <w:rPr>
+                <w:sz w:val="16"/>
                 <w:szCs w:val="20"/>
               </w:rPr>
               <w:t xml:space="preserve"> </w:t>
@@ -3205,6 +3230,7 @@
             <w:proofErr w:type="spellStart"/>
             <w:r>
               <w:rPr>
+                <w:sz w:val="16"/>
                 <w:szCs w:val="20"/>
               </w:rPr>
               <w:t>endfor</w:t>
@@ -3212,6 +3238,7 @@
             <w:proofErr w:type="spellEnd"/>
             <w:r>
               <w:rPr>
+                <w:sz w:val="16"/>
                 <w:szCs w:val="20"/>
               </w:rPr>
               <w:t xml:space="preserve"> %}</w:t>
@@ -5394,7 +5421,7 @@
 </file>
 
 <file path=customXml/itemProps1.xml><?xml version="1.0" encoding="utf-8"?>
-<ds:datastoreItem xmlns:ds="http://schemas.openxmlformats.org/officeDocument/2006/customXml" ds:itemID="{F10B45E0-C0C9-4CB9-BD93-F2A1F62AB144}">
+<ds:datastoreItem xmlns:ds="http://schemas.openxmlformats.org/officeDocument/2006/customXml" ds:itemID="{1928942E-7DF0-4AE6-B95A-0136E44EEC5B}">
   <ds:schemaRefs>
     <ds:schemaRef ds:uri="http://schemas.openxmlformats.org/officeDocument/2006/bibliography"/>
   </ds:schemaRefs>

</xml_diff>